<commit_message>
Add profile email editing for notifications
</commit_message>
<xml_diff>
--- a/project docs/goZaika_Technology_Specification_v2.docx
+++ b/project docs/goZaika_Technology_Specification_v2.docx
@@ -573,14 +573,7 @@
                 <w:sz w:val="18"/>
                 <w:szCs w:val="18"/>
               </w:rPr>
-              <w:t>Next.js 16.2.4</w:t>
-            </w:r>
-            <w:r>
-              <w:rPr>
-                <w:sz w:val="18"/>
-                <w:szCs w:val="18"/>
-              </w:rPr>
-              <w:t xml:space="preserve"> (App Router) + TypeScript</w:t>
+              <w:t>Next.js 16.2.4 (App Router) + TypeScript</w:t>
             </w:r>
           </w:p>
         </w:tc>
@@ -971,7 +964,21 @@
                 <w:sz w:val="18"/>
                 <w:szCs w:val="18"/>
               </w:rPr>
-              <w:t>Owner: drop scheduling, Zayka Pro analytics, financials</w:t>
+              <w:t xml:space="preserve">Owner: drop scheduling, </w:t>
+            </w:r>
+            <w:r>
+              <w:rPr>
+                <w:sz w:val="18"/>
+                <w:szCs w:val="18"/>
+              </w:rPr>
+              <w:t>Zaika</w:t>
+            </w:r>
+            <w:r>
+              <w:rPr>
+                <w:sz w:val="18"/>
+                <w:szCs w:val="18"/>
+              </w:rPr>
+              <w:t xml:space="preserve"> Pro analytics, financials</w:t>
             </w:r>
           </w:p>
         </w:tc>
@@ -6407,7 +6414,21 @@
                 <w:sz w:val="18"/>
                 <w:szCs w:val="18"/>
               </w:rPr>
-              <w:t>Premium/Spotlight drop badges, Zayka Gold tier</w:t>
+              <w:t xml:space="preserve">Premium/Spotlight drop badges, </w:t>
+            </w:r>
+            <w:r>
+              <w:rPr>
+                <w:sz w:val="18"/>
+                <w:szCs w:val="18"/>
+              </w:rPr>
+              <w:t>Zaika</w:t>
+            </w:r>
+            <w:r>
+              <w:rPr>
+                <w:sz w:val="18"/>
+                <w:szCs w:val="18"/>
+              </w:rPr>
+              <w:t xml:space="preserve"> Gold tier</w:t>
             </w:r>
           </w:p>
         </w:tc>
@@ -8190,7 +8211,14 @@
                 <w:sz w:val="18"/>
                 <w:szCs w:val="18"/>
               </w:rPr>
-              <w:t>Zayka Passport</w:t>
+              <w:t>Zaika</w:t>
+            </w:r>
+            <w:r>
+              <w:rPr>
+                <w:sz w:val="18"/>
+                <w:szCs w:val="18"/>
+              </w:rPr>
+              <w:t xml:space="preserve"> Passport</w:t>
             </w:r>
           </w:p>
         </w:tc>
@@ -10348,7 +10376,13 @@
         <w:pStyle w:val="Heading1"/>
       </w:pPr>
       <w:r>
-        <w:t>SECTION F — Restaurant Management Portal (Zayka Pro)</w:t>
+        <w:t>SECTION F — Restaurant Management Portal (</w:t>
+      </w:r>
+      <w:r>
+        <w:t>Zaika</w:t>
+      </w:r>
+      <w:r>
+        <w:t xml:space="preserve"> Pro)</w:t>
       </w:r>
     </w:p>
     <w:p>
@@ -10371,10 +10405,7 @@
         <w:t>portal</w:t>
       </w:r>
       <w:r>
-        <w:t xml:space="preserve"> </w:t>
-      </w:r>
-      <w:r>
-        <w:t xml:space="preserve"> portal</w:t>
+        <w:t xml:space="preserve">  portal</w:t>
       </w:r>
       <w:proofErr w:type="gramEnd"/>
       <w:r>
@@ -10386,7 +10417,13 @@
       </w:r>
       <w:proofErr w:type="spellEnd"/>
       <w:r>
-        <w:t xml:space="preserve"> with restaurant-scoped RLS. Provides drop lifecycle management, bag template library, financial dashboards, team management, and Zayka Pro analytics.</w:t>
+        <w:t xml:space="preserve"> with restaurant-scoped RLS. Provides drop lifecycle management, bag template library, financial dashboards, team management, and </w:t>
+      </w:r>
+      <w:r>
+        <w:t>Zaika</w:t>
+      </w:r>
+      <w:r>
+        <w:t xml:space="preserve"> Pro analytics.</w:t>
       </w:r>
     </w:p>
     <w:p>
@@ -10981,7 +11018,21 @@
                 <w:sz w:val="18"/>
                 <w:szCs w:val="18"/>
               </w:rPr>
-              <w:t>Analytics (Zayka Pro)</w:t>
+              <w:t>Analytics (</w:t>
+            </w:r>
+            <w:r>
+              <w:rPr>
+                <w:sz w:val="18"/>
+                <w:szCs w:val="18"/>
+              </w:rPr>
+              <w:t>Zaika</w:t>
+            </w:r>
+            <w:r>
+              <w:rPr>
+                <w:sz w:val="18"/>
+                <w:szCs w:val="18"/>
+              </w:rPr>
+              <w:t xml:space="preserve"> Pro)</w:t>
             </w:r>
           </w:p>
         </w:tc>
@@ -12532,7 +12583,13 @@
         <w:pStyle w:val="Heading2"/>
       </w:pPr>
       <w:r>
-        <w:t>F.6 Zayka Pro Analytics Modules</w:t>
+        <w:t xml:space="preserve">F.6 </w:t>
+      </w:r>
+      <w:r>
+        <w:t>Zaika</w:t>
+      </w:r>
+      <w:r>
+        <w:t xml:space="preserve"> Pro Analytics Modules</w:t>
       </w:r>
     </w:p>
     <w:tbl>
@@ -13337,10 +13394,7 @@
         <w:t>Next.js 16.2.4 App Router + React 19.2.4 portal</w:t>
       </w:r>
       <w:r>
-        <w:t xml:space="preserve"> </w:t>
-      </w:r>
-      <w:r>
-        <w:t xml:space="preserve">for </w:t>
+        <w:t xml:space="preserve"> for </w:t>
       </w:r>
       <w:proofErr w:type="spellStart"/>
       <w:r>
@@ -17944,40 +17998,38 @@
     </w:p>
     <w:tbl>
       <w:tblPr>
-        <w:tblW w:type="auto" w:w="0"/>
+        <w:tblW w:w="0" w:type="auto"/>
         <w:tblLayout w:type="fixed"/>
-        <w:tblLook w:firstColumn="1" w:firstRow="1" w:lastColumn="0" w:lastRow="0" w:noHBand="0" w:noVBand="1" w:val="04A0"/>
+        <w:tblLook w:val="04A0" w:firstRow="1" w:lastRow="0" w:firstColumn="1" w:lastColumn="0" w:noHBand="0" w:noVBand="1"/>
       </w:tblPr>
       <w:tblGrid>
-        <w:gridCol w:w="2340"/>
-        <w:gridCol w:w="2340"/>
-        <w:gridCol w:w="2340"/>
-        <w:gridCol w:w="2340"/>
+        <w:gridCol w:w="1800"/>
+        <w:gridCol w:w="1800"/>
+        <w:gridCol w:w="4320"/>
+        <w:gridCol w:w="4320"/>
       </w:tblGrid>
       <w:tr>
         <w:tc>
           <w:tcPr>
-            <w:tcW w:type="dxa" w:w="1800"/>
-            <w:vAlign w:val="center"/>
-            <w:tcMar>
-              <w:top w:w="90" w:type="dxa"/>
-              <w:start w:w="90" w:type="dxa"/>
-              <w:bottom w:w="90" w:type="dxa"/>
-              <w:end w:w="90" w:type="dxa"/>
-            </w:tcMar>
+            <w:tcW w:w="1800" w:type="dxa"/>
             <w:tcBorders>
               <w:top w:val="single" w:sz="6" w:space="0" w:color="D9E2DD"/>
               <w:left w:val="single" w:sz="6" w:space="0" w:color="D9E2DD"/>
               <w:bottom w:val="single" w:sz="6" w:space="0" w:color="D9E2DD"/>
               <w:right w:val="single" w:sz="6" w:space="0" w:color="D9E2DD"/>
-              <w:insideH w:val="single" w:sz="6" w:space="0" w:color="D9E2DD"/>
-              <w:insideV w:val="single" w:sz="6" w:space="0" w:color="D9E2DD"/>
-            </w:tcBorders>
-            <w:shd w:fill="1A5C38"/>
+            </w:tcBorders>
+            <w:shd w:val="clear" w:color="auto" w:fill="1A5C38"/>
+            <w:tcMar>
+              <w:top w:w="90" w:type="dxa"/>
+              <w:left w:w="90" w:type="dxa"/>
+              <w:bottom w:w="90" w:type="dxa"/>
+              <w:right w:w="90" w:type="dxa"/>
+            </w:tcMar>
+            <w:vAlign w:val="center"/>
           </w:tcPr>
           <w:p>
             <w:pPr>
-              <w:spacing w:after="0" w:line="259" w:lineRule="auto"/>
+              <w:spacing w:line="259" w:lineRule="auto"/>
               <w:jc w:val="center"/>
             </w:pPr>
             <w:r>
@@ -17992,27 +18044,25 @@
         </w:tc>
         <w:tc>
           <w:tcPr>
-            <w:tcW w:type="dxa" w:w="1800"/>
-            <w:vAlign w:val="center"/>
-            <w:tcMar>
-              <w:top w:w="90" w:type="dxa"/>
-              <w:start w:w="90" w:type="dxa"/>
-              <w:bottom w:w="90" w:type="dxa"/>
-              <w:end w:w="90" w:type="dxa"/>
-            </w:tcMar>
+            <w:tcW w:w="1800" w:type="dxa"/>
             <w:tcBorders>
               <w:top w:val="single" w:sz="6" w:space="0" w:color="D9E2DD"/>
               <w:left w:val="single" w:sz="6" w:space="0" w:color="D9E2DD"/>
               <w:bottom w:val="single" w:sz="6" w:space="0" w:color="D9E2DD"/>
               <w:right w:val="single" w:sz="6" w:space="0" w:color="D9E2DD"/>
-              <w:insideH w:val="single" w:sz="6" w:space="0" w:color="D9E2DD"/>
-              <w:insideV w:val="single" w:sz="6" w:space="0" w:color="D9E2DD"/>
-            </w:tcBorders>
-            <w:shd w:fill="1A5C38"/>
+            </w:tcBorders>
+            <w:shd w:val="clear" w:color="auto" w:fill="1A5C38"/>
+            <w:tcMar>
+              <w:top w:w="90" w:type="dxa"/>
+              <w:left w:w="90" w:type="dxa"/>
+              <w:bottom w:w="90" w:type="dxa"/>
+              <w:right w:w="90" w:type="dxa"/>
+            </w:tcMar>
+            <w:vAlign w:val="center"/>
           </w:tcPr>
           <w:p>
             <w:pPr>
-              <w:spacing w:after="0" w:line="259" w:lineRule="auto"/>
+              <w:spacing w:line="259" w:lineRule="auto"/>
               <w:jc w:val="center"/>
             </w:pPr>
             <w:r>
@@ -18027,27 +18077,25 @@
         </w:tc>
         <w:tc>
           <w:tcPr>
-            <w:tcW w:type="dxa" w:w="4320"/>
-            <w:vAlign w:val="center"/>
-            <w:tcMar>
-              <w:top w:w="90" w:type="dxa"/>
-              <w:start w:w="90" w:type="dxa"/>
-              <w:bottom w:w="90" w:type="dxa"/>
-              <w:end w:w="90" w:type="dxa"/>
-            </w:tcMar>
+            <w:tcW w:w="4320" w:type="dxa"/>
             <w:tcBorders>
               <w:top w:val="single" w:sz="6" w:space="0" w:color="D9E2DD"/>
               <w:left w:val="single" w:sz="6" w:space="0" w:color="D9E2DD"/>
               <w:bottom w:val="single" w:sz="6" w:space="0" w:color="D9E2DD"/>
               <w:right w:val="single" w:sz="6" w:space="0" w:color="D9E2DD"/>
-              <w:insideH w:val="single" w:sz="6" w:space="0" w:color="D9E2DD"/>
-              <w:insideV w:val="single" w:sz="6" w:space="0" w:color="D9E2DD"/>
-            </w:tcBorders>
-            <w:shd w:fill="1A5C38"/>
+            </w:tcBorders>
+            <w:shd w:val="clear" w:color="auto" w:fill="1A5C38"/>
+            <w:tcMar>
+              <w:top w:w="90" w:type="dxa"/>
+              <w:left w:w="90" w:type="dxa"/>
+              <w:bottom w:w="90" w:type="dxa"/>
+              <w:right w:w="90" w:type="dxa"/>
+            </w:tcMar>
+            <w:vAlign w:val="center"/>
           </w:tcPr>
           <w:p>
             <w:pPr>
-              <w:spacing w:after="0" w:line="259" w:lineRule="auto"/>
+              <w:spacing w:line="259" w:lineRule="auto"/>
               <w:jc w:val="center"/>
             </w:pPr>
             <w:r>
@@ -18062,27 +18110,25 @@
         </w:tc>
         <w:tc>
           <w:tcPr>
-            <w:tcW w:type="dxa" w:w="4320"/>
-            <w:vAlign w:val="center"/>
-            <w:tcMar>
-              <w:top w:w="90" w:type="dxa"/>
-              <w:start w:w="90" w:type="dxa"/>
-              <w:bottom w:w="90" w:type="dxa"/>
-              <w:end w:w="90" w:type="dxa"/>
-            </w:tcMar>
+            <w:tcW w:w="4320" w:type="dxa"/>
             <w:tcBorders>
               <w:top w:val="single" w:sz="6" w:space="0" w:color="D9E2DD"/>
               <w:left w:val="single" w:sz="6" w:space="0" w:color="D9E2DD"/>
               <w:bottom w:val="single" w:sz="6" w:space="0" w:color="D9E2DD"/>
               <w:right w:val="single" w:sz="6" w:space="0" w:color="D9E2DD"/>
-              <w:insideH w:val="single" w:sz="6" w:space="0" w:color="D9E2DD"/>
-              <w:insideV w:val="single" w:sz="6" w:space="0" w:color="D9E2DD"/>
-            </w:tcBorders>
-            <w:shd w:fill="1A5C38"/>
+            </w:tcBorders>
+            <w:shd w:val="clear" w:color="auto" w:fill="1A5C38"/>
+            <w:tcMar>
+              <w:top w:w="90" w:type="dxa"/>
+              <w:left w:w="90" w:type="dxa"/>
+              <w:bottom w:w="90" w:type="dxa"/>
+              <w:right w:w="90" w:type="dxa"/>
+            </w:tcMar>
+            <w:vAlign w:val="center"/>
           </w:tcPr>
           <w:p>
             <w:pPr>
-              <w:spacing w:after="0" w:line="259" w:lineRule="auto"/>
+              <w:spacing w:line="259" w:lineRule="auto"/>
               <w:jc w:val="center"/>
             </w:pPr>
             <w:r>
@@ -18099,26 +18145,24 @@
       <w:tr>
         <w:tc>
           <w:tcPr>
-            <w:tcW w:type="dxa" w:w="1800"/>
-            <w:vAlign w:val="center"/>
-            <w:tcMar>
-              <w:top w:w="90" w:type="dxa"/>
-              <w:start w:w="90" w:type="dxa"/>
-              <w:bottom w:w="90" w:type="dxa"/>
-              <w:end w:w="90" w:type="dxa"/>
-            </w:tcMar>
+            <w:tcW w:w="1800" w:type="dxa"/>
             <w:tcBorders>
               <w:top w:val="single" w:sz="6" w:space="0" w:color="D9E2DD"/>
               <w:left w:val="single" w:sz="6" w:space="0" w:color="D9E2DD"/>
               <w:bottom w:val="single" w:sz="6" w:space="0" w:color="D9E2DD"/>
               <w:right w:val="single" w:sz="6" w:space="0" w:color="D9E2DD"/>
-              <w:insideH w:val="single" w:sz="6" w:space="0" w:color="D9E2DD"/>
-              <w:insideV w:val="single" w:sz="6" w:space="0" w:color="D9E2DD"/>
-            </w:tcBorders>
+            </w:tcBorders>
+            <w:tcMar>
+              <w:top w:w="90" w:type="dxa"/>
+              <w:left w:w="90" w:type="dxa"/>
+              <w:bottom w:w="90" w:type="dxa"/>
+              <w:right w:w="90" w:type="dxa"/>
+            </w:tcMar>
+            <w:vAlign w:val="center"/>
           </w:tcPr>
           <w:p>
             <w:pPr>
-              <w:spacing w:after="0" w:line="259" w:lineRule="auto"/>
+              <w:spacing w:line="259" w:lineRule="auto"/>
             </w:pPr>
             <w:r>
               <w:rPr>
@@ -18130,26 +18174,24 @@
         </w:tc>
         <w:tc>
           <w:tcPr>
-            <w:tcW w:type="dxa" w:w="1800"/>
-            <w:vAlign w:val="center"/>
-            <w:tcMar>
-              <w:top w:w="90" w:type="dxa"/>
-              <w:start w:w="90" w:type="dxa"/>
-              <w:bottom w:w="90" w:type="dxa"/>
-              <w:end w:w="90" w:type="dxa"/>
-            </w:tcMar>
+            <w:tcW w:w="1800" w:type="dxa"/>
             <w:tcBorders>
               <w:top w:val="single" w:sz="6" w:space="0" w:color="D9E2DD"/>
               <w:left w:val="single" w:sz="6" w:space="0" w:color="D9E2DD"/>
               <w:bottom w:val="single" w:sz="6" w:space="0" w:color="D9E2DD"/>
               <w:right w:val="single" w:sz="6" w:space="0" w:color="D9E2DD"/>
-              <w:insideH w:val="single" w:sz="6" w:space="0" w:color="D9E2DD"/>
-              <w:insideV w:val="single" w:sz="6" w:space="0" w:color="D9E2DD"/>
-            </w:tcBorders>
+            </w:tcBorders>
+            <w:tcMar>
+              <w:top w:w="90" w:type="dxa"/>
+              <w:left w:w="90" w:type="dxa"/>
+              <w:bottom w:w="90" w:type="dxa"/>
+              <w:right w:w="90" w:type="dxa"/>
+            </w:tcMar>
+            <w:vAlign w:val="center"/>
           </w:tcPr>
           <w:p>
             <w:pPr>
-              <w:spacing w:after="0" w:line="259" w:lineRule="auto"/>
+              <w:spacing w:line="259" w:lineRule="auto"/>
             </w:pPr>
             <w:r>
               <w:rPr>
@@ -18161,26 +18203,24 @@
         </w:tc>
         <w:tc>
           <w:tcPr>
-            <w:tcW w:type="dxa" w:w="4320"/>
-            <w:vAlign w:val="center"/>
-            <w:tcMar>
-              <w:top w:w="90" w:type="dxa"/>
-              <w:start w:w="90" w:type="dxa"/>
-              <w:bottom w:w="90" w:type="dxa"/>
-              <w:end w:w="90" w:type="dxa"/>
-            </w:tcMar>
+            <w:tcW w:w="4320" w:type="dxa"/>
             <w:tcBorders>
               <w:top w:val="single" w:sz="6" w:space="0" w:color="D9E2DD"/>
               <w:left w:val="single" w:sz="6" w:space="0" w:color="D9E2DD"/>
               <w:bottom w:val="single" w:sz="6" w:space="0" w:color="D9E2DD"/>
               <w:right w:val="single" w:sz="6" w:space="0" w:color="D9E2DD"/>
-              <w:insideH w:val="single" w:sz="6" w:space="0" w:color="D9E2DD"/>
-              <w:insideV w:val="single" w:sz="6" w:space="0" w:color="D9E2DD"/>
-            </w:tcBorders>
+            </w:tcBorders>
+            <w:tcMar>
+              <w:top w:w="90" w:type="dxa"/>
+              <w:left w:w="90" w:type="dxa"/>
+              <w:bottom w:w="90" w:type="dxa"/>
+              <w:right w:w="90" w:type="dxa"/>
+            </w:tcMar>
+            <w:vAlign w:val="center"/>
           </w:tcPr>
           <w:p>
             <w:pPr>
-              <w:spacing w:after="0" w:line="259" w:lineRule="auto"/>
+              <w:spacing w:line="259" w:lineRule="auto"/>
             </w:pPr>
             <w:r>
               <w:rPr>
@@ -18192,26 +18232,24 @@
         </w:tc>
         <w:tc>
           <w:tcPr>
-            <w:tcW w:type="dxa" w:w="4320"/>
-            <w:vAlign w:val="center"/>
-            <w:tcMar>
-              <w:top w:w="90" w:type="dxa"/>
-              <w:start w:w="90" w:type="dxa"/>
-              <w:bottom w:w="90" w:type="dxa"/>
-              <w:end w:w="90" w:type="dxa"/>
-            </w:tcMar>
+            <w:tcW w:w="4320" w:type="dxa"/>
             <w:tcBorders>
               <w:top w:val="single" w:sz="6" w:space="0" w:color="D9E2DD"/>
               <w:left w:val="single" w:sz="6" w:space="0" w:color="D9E2DD"/>
               <w:bottom w:val="single" w:sz="6" w:space="0" w:color="D9E2DD"/>
               <w:right w:val="single" w:sz="6" w:space="0" w:color="D9E2DD"/>
-              <w:insideH w:val="single" w:sz="6" w:space="0" w:color="D9E2DD"/>
-              <w:insideV w:val="single" w:sz="6" w:space="0" w:color="D9E2DD"/>
-            </w:tcBorders>
+            </w:tcBorders>
+            <w:tcMar>
+              <w:top w:w="90" w:type="dxa"/>
+              <w:left w:w="90" w:type="dxa"/>
+              <w:bottom w:w="90" w:type="dxa"/>
+              <w:right w:w="90" w:type="dxa"/>
+            </w:tcMar>
+            <w:vAlign w:val="center"/>
           </w:tcPr>
           <w:p>
             <w:pPr>
-              <w:spacing w:after="0" w:line="259" w:lineRule="auto"/>
+              <w:spacing w:line="259" w:lineRule="auto"/>
             </w:pPr>
             <w:r>
               <w:rPr>
@@ -18225,26 +18263,24 @@
       <w:tr>
         <w:tc>
           <w:tcPr>
-            <w:tcW w:type="dxa" w:w="1800"/>
-            <w:vAlign w:val="center"/>
-            <w:tcMar>
-              <w:top w:w="90" w:type="dxa"/>
-              <w:start w:w="90" w:type="dxa"/>
-              <w:bottom w:w="90" w:type="dxa"/>
-              <w:end w:w="90" w:type="dxa"/>
-            </w:tcMar>
+            <w:tcW w:w="1800" w:type="dxa"/>
             <w:tcBorders>
               <w:top w:val="single" w:sz="6" w:space="0" w:color="D9E2DD"/>
               <w:left w:val="single" w:sz="6" w:space="0" w:color="D9E2DD"/>
               <w:bottom w:val="single" w:sz="6" w:space="0" w:color="D9E2DD"/>
               <w:right w:val="single" w:sz="6" w:space="0" w:color="D9E2DD"/>
-              <w:insideH w:val="single" w:sz="6" w:space="0" w:color="D9E2DD"/>
-              <w:insideV w:val="single" w:sz="6" w:space="0" w:color="D9E2DD"/>
-            </w:tcBorders>
+            </w:tcBorders>
+            <w:tcMar>
+              <w:top w:w="90" w:type="dxa"/>
+              <w:left w:w="90" w:type="dxa"/>
+              <w:bottom w:w="90" w:type="dxa"/>
+              <w:right w:w="90" w:type="dxa"/>
+            </w:tcMar>
+            <w:vAlign w:val="center"/>
           </w:tcPr>
           <w:p>
             <w:pPr>
-              <w:spacing w:after="0" w:line="259" w:lineRule="auto"/>
+              <w:spacing w:line="259" w:lineRule="auto"/>
             </w:pPr>
             <w:r>
               <w:rPr>
@@ -18256,26 +18292,24 @@
         </w:tc>
         <w:tc>
           <w:tcPr>
-            <w:tcW w:type="dxa" w:w="1800"/>
-            <w:vAlign w:val="center"/>
-            <w:tcMar>
-              <w:top w:w="90" w:type="dxa"/>
-              <w:start w:w="90" w:type="dxa"/>
-              <w:bottom w:w="90" w:type="dxa"/>
-              <w:end w:w="90" w:type="dxa"/>
-            </w:tcMar>
+            <w:tcW w:w="1800" w:type="dxa"/>
             <w:tcBorders>
               <w:top w:val="single" w:sz="6" w:space="0" w:color="D9E2DD"/>
               <w:left w:val="single" w:sz="6" w:space="0" w:color="D9E2DD"/>
               <w:bottom w:val="single" w:sz="6" w:space="0" w:color="D9E2DD"/>
               <w:right w:val="single" w:sz="6" w:space="0" w:color="D9E2DD"/>
-              <w:insideH w:val="single" w:sz="6" w:space="0" w:color="D9E2DD"/>
-              <w:insideV w:val="single" w:sz="6" w:space="0" w:color="D9E2DD"/>
-            </w:tcBorders>
+            </w:tcBorders>
+            <w:tcMar>
+              <w:top w:w="90" w:type="dxa"/>
+              <w:left w:w="90" w:type="dxa"/>
+              <w:bottom w:w="90" w:type="dxa"/>
+              <w:right w:w="90" w:type="dxa"/>
+            </w:tcMar>
+            <w:vAlign w:val="center"/>
           </w:tcPr>
           <w:p>
             <w:pPr>
-              <w:spacing w:after="0" w:line="259" w:lineRule="auto"/>
+              <w:spacing w:line="259" w:lineRule="auto"/>
             </w:pPr>
             <w:r>
               <w:rPr>
@@ -18287,26 +18321,24 @@
         </w:tc>
         <w:tc>
           <w:tcPr>
-            <w:tcW w:type="dxa" w:w="4320"/>
-            <w:vAlign w:val="center"/>
-            <w:tcMar>
-              <w:top w:w="90" w:type="dxa"/>
-              <w:start w:w="90" w:type="dxa"/>
-              <w:bottom w:w="90" w:type="dxa"/>
-              <w:end w:w="90" w:type="dxa"/>
-            </w:tcMar>
+            <w:tcW w:w="4320" w:type="dxa"/>
             <w:tcBorders>
               <w:top w:val="single" w:sz="6" w:space="0" w:color="D9E2DD"/>
               <w:left w:val="single" w:sz="6" w:space="0" w:color="D9E2DD"/>
               <w:bottom w:val="single" w:sz="6" w:space="0" w:color="D9E2DD"/>
               <w:right w:val="single" w:sz="6" w:space="0" w:color="D9E2DD"/>
-              <w:insideH w:val="single" w:sz="6" w:space="0" w:color="D9E2DD"/>
-              <w:insideV w:val="single" w:sz="6" w:space="0" w:color="D9E2DD"/>
-            </w:tcBorders>
+            </w:tcBorders>
+            <w:tcMar>
+              <w:top w:w="90" w:type="dxa"/>
+              <w:left w:w="90" w:type="dxa"/>
+              <w:bottom w:w="90" w:type="dxa"/>
+              <w:right w:w="90" w:type="dxa"/>
+            </w:tcMar>
+            <w:vAlign w:val="center"/>
           </w:tcPr>
           <w:p>
             <w:pPr>
-              <w:spacing w:after="0" w:line="259" w:lineRule="auto"/>
+              <w:spacing w:line="259" w:lineRule="auto"/>
             </w:pPr>
             <w:r>
               <w:rPr>
@@ -18318,26 +18350,24 @@
         </w:tc>
         <w:tc>
           <w:tcPr>
-            <w:tcW w:type="dxa" w:w="4320"/>
-            <w:vAlign w:val="center"/>
-            <w:tcMar>
-              <w:top w:w="90" w:type="dxa"/>
-              <w:start w:w="90" w:type="dxa"/>
-              <w:bottom w:w="90" w:type="dxa"/>
-              <w:end w:w="90" w:type="dxa"/>
-            </w:tcMar>
+            <w:tcW w:w="4320" w:type="dxa"/>
             <w:tcBorders>
               <w:top w:val="single" w:sz="6" w:space="0" w:color="D9E2DD"/>
               <w:left w:val="single" w:sz="6" w:space="0" w:color="D9E2DD"/>
               <w:bottom w:val="single" w:sz="6" w:space="0" w:color="D9E2DD"/>
               <w:right w:val="single" w:sz="6" w:space="0" w:color="D9E2DD"/>
-              <w:insideH w:val="single" w:sz="6" w:space="0" w:color="D9E2DD"/>
-              <w:insideV w:val="single" w:sz="6" w:space="0" w:color="D9E2DD"/>
-            </w:tcBorders>
+            </w:tcBorders>
+            <w:tcMar>
+              <w:top w:w="90" w:type="dxa"/>
+              <w:left w:w="90" w:type="dxa"/>
+              <w:bottom w:w="90" w:type="dxa"/>
+              <w:right w:w="90" w:type="dxa"/>
+            </w:tcMar>
+            <w:vAlign w:val="center"/>
           </w:tcPr>
           <w:p>
             <w:pPr>
-              <w:spacing w:after="0" w:line="259" w:lineRule="auto"/>
+              <w:spacing w:line="259" w:lineRule="auto"/>
             </w:pPr>
             <w:r>
               <w:rPr>
@@ -18351,26 +18381,24 @@
       <w:tr>
         <w:tc>
           <w:tcPr>
-            <w:tcW w:type="dxa" w:w="1800"/>
-            <w:vAlign w:val="center"/>
-            <w:tcMar>
-              <w:top w:w="90" w:type="dxa"/>
-              <w:start w:w="90" w:type="dxa"/>
-              <w:bottom w:w="90" w:type="dxa"/>
-              <w:end w:w="90" w:type="dxa"/>
-            </w:tcMar>
+            <w:tcW w:w="1800" w:type="dxa"/>
             <w:tcBorders>
               <w:top w:val="single" w:sz="6" w:space="0" w:color="D9E2DD"/>
               <w:left w:val="single" w:sz="6" w:space="0" w:color="D9E2DD"/>
               <w:bottom w:val="single" w:sz="6" w:space="0" w:color="D9E2DD"/>
               <w:right w:val="single" w:sz="6" w:space="0" w:color="D9E2DD"/>
-              <w:insideH w:val="single" w:sz="6" w:space="0" w:color="D9E2DD"/>
-              <w:insideV w:val="single" w:sz="6" w:space="0" w:color="D9E2DD"/>
-            </w:tcBorders>
+            </w:tcBorders>
+            <w:tcMar>
+              <w:top w:w="90" w:type="dxa"/>
+              <w:left w:w="90" w:type="dxa"/>
+              <w:bottom w:w="90" w:type="dxa"/>
+              <w:right w:w="90" w:type="dxa"/>
+            </w:tcMar>
+            <w:vAlign w:val="center"/>
           </w:tcPr>
           <w:p>
             <w:pPr>
-              <w:spacing w:after="0" w:line="259" w:lineRule="auto"/>
+              <w:spacing w:line="259" w:lineRule="auto"/>
             </w:pPr>
             <w:r>
               <w:rPr>
@@ -18382,26 +18410,24 @@
         </w:tc>
         <w:tc>
           <w:tcPr>
-            <w:tcW w:type="dxa" w:w="1800"/>
-            <w:vAlign w:val="center"/>
-            <w:tcMar>
-              <w:top w:w="90" w:type="dxa"/>
-              <w:start w:w="90" w:type="dxa"/>
-              <w:bottom w:w="90" w:type="dxa"/>
-              <w:end w:w="90" w:type="dxa"/>
-            </w:tcMar>
+            <w:tcW w:w="1800" w:type="dxa"/>
             <w:tcBorders>
               <w:top w:val="single" w:sz="6" w:space="0" w:color="D9E2DD"/>
               <w:left w:val="single" w:sz="6" w:space="0" w:color="D9E2DD"/>
               <w:bottom w:val="single" w:sz="6" w:space="0" w:color="D9E2DD"/>
               <w:right w:val="single" w:sz="6" w:space="0" w:color="D9E2DD"/>
-              <w:insideH w:val="single" w:sz="6" w:space="0" w:color="D9E2DD"/>
-              <w:insideV w:val="single" w:sz="6" w:space="0" w:color="D9E2DD"/>
-            </w:tcBorders>
+            </w:tcBorders>
+            <w:tcMar>
+              <w:top w:w="90" w:type="dxa"/>
+              <w:left w:w="90" w:type="dxa"/>
+              <w:bottom w:w="90" w:type="dxa"/>
+              <w:right w:w="90" w:type="dxa"/>
+            </w:tcMar>
+            <w:vAlign w:val="center"/>
           </w:tcPr>
           <w:p>
             <w:pPr>
-              <w:spacing w:after="0" w:line="259" w:lineRule="auto"/>
+              <w:spacing w:line="259" w:lineRule="auto"/>
             </w:pPr>
             <w:r>
               <w:rPr>
@@ -18413,26 +18439,24 @@
         </w:tc>
         <w:tc>
           <w:tcPr>
-            <w:tcW w:type="dxa" w:w="4320"/>
-            <w:vAlign w:val="center"/>
-            <w:tcMar>
-              <w:top w:w="90" w:type="dxa"/>
-              <w:start w:w="90" w:type="dxa"/>
-              <w:bottom w:w="90" w:type="dxa"/>
-              <w:end w:w="90" w:type="dxa"/>
-            </w:tcMar>
+            <w:tcW w:w="4320" w:type="dxa"/>
             <w:tcBorders>
               <w:top w:val="single" w:sz="6" w:space="0" w:color="D9E2DD"/>
               <w:left w:val="single" w:sz="6" w:space="0" w:color="D9E2DD"/>
               <w:bottom w:val="single" w:sz="6" w:space="0" w:color="D9E2DD"/>
               <w:right w:val="single" w:sz="6" w:space="0" w:color="D9E2DD"/>
-              <w:insideH w:val="single" w:sz="6" w:space="0" w:color="D9E2DD"/>
-              <w:insideV w:val="single" w:sz="6" w:space="0" w:color="D9E2DD"/>
-            </w:tcBorders>
+            </w:tcBorders>
+            <w:tcMar>
+              <w:top w:w="90" w:type="dxa"/>
+              <w:left w:w="90" w:type="dxa"/>
+              <w:bottom w:w="90" w:type="dxa"/>
+              <w:right w:w="90" w:type="dxa"/>
+            </w:tcMar>
+            <w:vAlign w:val="center"/>
           </w:tcPr>
           <w:p>
             <w:pPr>
-              <w:spacing w:after="0" w:line="259" w:lineRule="auto"/>
+              <w:spacing w:line="259" w:lineRule="auto"/>
             </w:pPr>
             <w:r>
               <w:rPr>
@@ -18444,26 +18468,24 @@
         </w:tc>
         <w:tc>
           <w:tcPr>
-            <w:tcW w:type="dxa" w:w="4320"/>
-            <w:vAlign w:val="center"/>
-            <w:tcMar>
-              <w:top w:w="90" w:type="dxa"/>
-              <w:start w:w="90" w:type="dxa"/>
-              <w:bottom w:w="90" w:type="dxa"/>
-              <w:end w:w="90" w:type="dxa"/>
-            </w:tcMar>
+            <w:tcW w:w="4320" w:type="dxa"/>
             <w:tcBorders>
               <w:top w:val="single" w:sz="6" w:space="0" w:color="D9E2DD"/>
               <w:left w:val="single" w:sz="6" w:space="0" w:color="D9E2DD"/>
               <w:bottom w:val="single" w:sz="6" w:space="0" w:color="D9E2DD"/>
               <w:right w:val="single" w:sz="6" w:space="0" w:color="D9E2DD"/>
-              <w:insideH w:val="single" w:sz="6" w:space="0" w:color="D9E2DD"/>
-              <w:insideV w:val="single" w:sz="6" w:space="0" w:color="D9E2DD"/>
-            </w:tcBorders>
+            </w:tcBorders>
+            <w:tcMar>
+              <w:top w:w="90" w:type="dxa"/>
+              <w:left w:w="90" w:type="dxa"/>
+              <w:bottom w:w="90" w:type="dxa"/>
+              <w:right w:w="90" w:type="dxa"/>
+            </w:tcMar>
+            <w:vAlign w:val="center"/>
           </w:tcPr>
           <w:p>
             <w:pPr>
-              <w:spacing w:after="0" w:line="259" w:lineRule="auto"/>
+              <w:spacing w:line="259" w:lineRule="auto"/>
             </w:pPr>
             <w:r>
               <w:rPr>
@@ -18488,40 +18510,38 @@
     </w:p>
     <w:tbl>
       <w:tblPr>
-        <w:tblW w:type="auto" w:w="0"/>
+        <w:tblW w:w="0" w:type="auto"/>
         <w:tblLayout w:type="fixed"/>
-        <w:tblLook w:firstColumn="1" w:firstRow="1" w:lastColumn="0" w:lastRow="0" w:noHBand="0" w:noVBand="1" w:val="04A0"/>
+        <w:tblLook w:val="04A0" w:firstRow="1" w:lastRow="0" w:firstColumn="1" w:lastColumn="0" w:noHBand="0" w:noVBand="1"/>
       </w:tblPr>
       <w:tblGrid>
-        <w:gridCol w:w="2340"/>
-        <w:gridCol w:w="2340"/>
-        <w:gridCol w:w="2340"/>
-        <w:gridCol w:w="2340"/>
+        <w:gridCol w:w="1080"/>
+        <w:gridCol w:w="2592"/>
+        <w:gridCol w:w="4392"/>
+        <w:gridCol w:w="4176"/>
       </w:tblGrid>
       <w:tr>
         <w:tc>
           <w:tcPr>
-            <w:tcW w:type="dxa" w:w="1080"/>
-            <w:vAlign w:val="center"/>
-            <w:tcMar>
-              <w:top w:w="90" w:type="dxa"/>
-              <w:start w:w="90" w:type="dxa"/>
-              <w:bottom w:w="90" w:type="dxa"/>
-              <w:end w:w="90" w:type="dxa"/>
-            </w:tcMar>
+            <w:tcW w:w="1080" w:type="dxa"/>
             <w:tcBorders>
               <w:top w:val="single" w:sz="6" w:space="0" w:color="D9E2DD"/>
               <w:left w:val="single" w:sz="6" w:space="0" w:color="D9E2DD"/>
               <w:bottom w:val="single" w:sz="6" w:space="0" w:color="D9E2DD"/>
               <w:right w:val="single" w:sz="6" w:space="0" w:color="D9E2DD"/>
-              <w:insideH w:val="single" w:sz="6" w:space="0" w:color="D9E2DD"/>
-              <w:insideV w:val="single" w:sz="6" w:space="0" w:color="D9E2DD"/>
-            </w:tcBorders>
-            <w:shd w:fill="1A5C38"/>
+            </w:tcBorders>
+            <w:shd w:val="clear" w:color="auto" w:fill="1A5C38"/>
+            <w:tcMar>
+              <w:top w:w="90" w:type="dxa"/>
+              <w:left w:w="90" w:type="dxa"/>
+              <w:bottom w:w="90" w:type="dxa"/>
+              <w:right w:w="90" w:type="dxa"/>
+            </w:tcMar>
+            <w:vAlign w:val="center"/>
           </w:tcPr>
           <w:p>
             <w:pPr>
-              <w:spacing w:after="0" w:line="259" w:lineRule="auto"/>
+              <w:spacing w:line="259" w:lineRule="auto"/>
               <w:jc w:val="center"/>
             </w:pPr>
             <w:r>
@@ -18536,27 +18556,25 @@
         </w:tc>
         <w:tc>
           <w:tcPr>
-            <w:tcW w:type="dxa" w:w="2592"/>
-            <w:vAlign w:val="center"/>
-            <w:tcMar>
-              <w:top w:w="90" w:type="dxa"/>
-              <w:start w:w="90" w:type="dxa"/>
-              <w:bottom w:w="90" w:type="dxa"/>
-              <w:end w:w="90" w:type="dxa"/>
-            </w:tcMar>
+            <w:tcW w:w="2592" w:type="dxa"/>
             <w:tcBorders>
               <w:top w:val="single" w:sz="6" w:space="0" w:color="D9E2DD"/>
               <w:left w:val="single" w:sz="6" w:space="0" w:color="D9E2DD"/>
               <w:bottom w:val="single" w:sz="6" w:space="0" w:color="D9E2DD"/>
               <w:right w:val="single" w:sz="6" w:space="0" w:color="D9E2DD"/>
-              <w:insideH w:val="single" w:sz="6" w:space="0" w:color="D9E2DD"/>
-              <w:insideV w:val="single" w:sz="6" w:space="0" w:color="D9E2DD"/>
-            </w:tcBorders>
-            <w:shd w:fill="1A5C38"/>
+            </w:tcBorders>
+            <w:shd w:val="clear" w:color="auto" w:fill="1A5C38"/>
+            <w:tcMar>
+              <w:top w:w="90" w:type="dxa"/>
+              <w:left w:w="90" w:type="dxa"/>
+              <w:bottom w:w="90" w:type="dxa"/>
+              <w:right w:w="90" w:type="dxa"/>
+            </w:tcMar>
+            <w:vAlign w:val="center"/>
           </w:tcPr>
           <w:p>
             <w:pPr>
-              <w:spacing w:after="0" w:line="259" w:lineRule="auto"/>
+              <w:spacing w:line="259" w:lineRule="auto"/>
               <w:jc w:val="center"/>
             </w:pPr>
             <w:r>
@@ -18571,27 +18589,25 @@
         </w:tc>
         <w:tc>
           <w:tcPr>
-            <w:tcW w:type="dxa" w:w="4392"/>
-            <w:vAlign w:val="center"/>
-            <w:tcMar>
-              <w:top w:w="90" w:type="dxa"/>
-              <w:start w:w="90" w:type="dxa"/>
-              <w:bottom w:w="90" w:type="dxa"/>
-              <w:end w:w="90" w:type="dxa"/>
-            </w:tcMar>
+            <w:tcW w:w="4392" w:type="dxa"/>
             <w:tcBorders>
               <w:top w:val="single" w:sz="6" w:space="0" w:color="D9E2DD"/>
               <w:left w:val="single" w:sz="6" w:space="0" w:color="D9E2DD"/>
               <w:bottom w:val="single" w:sz="6" w:space="0" w:color="D9E2DD"/>
               <w:right w:val="single" w:sz="6" w:space="0" w:color="D9E2DD"/>
-              <w:insideH w:val="single" w:sz="6" w:space="0" w:color="D9E2DD"/>
-              <w:insideV w:val="single" w:sz="6" w:space="0" w:color="D9E2DD"/>
-            </w:tcBorders>
-            <w:shd w:fill="1A5C38"/>
+            </w:tcBorders>
+            <w:shd w:val="clear" w:color="auto" w:fill="1A5C38"/>
+            <w:tcMar>
+              <w:top w:w="90" w:type="dxa"/>
+              <w:left w:w="90" w:type="dxa"/>
+              <w:bottom w:w="90" w:type="dxa"/>
+              <w:right w:w="90" w:type="dxa"/>
+            </w:tcMar>
+            <w:vAlign w:val="center"/>
           </w:tcPr>
           <w:p>
             <w:pPr>
-              <w:spacing w:after="0" w:line="259" w:lineRule="auto"/>
+              <w:spacing w:line="259" w:lineRule="auto"/>
               <w:jc w:val="center"/>
             </w:pPr>
             <w:r>
@@ -18606,27 +18622,25 @@
         </w:tc>
         <w:tc>
           <w:tcPr>
-            <w:tcW w:type="dxa" w:w="4176"/>
-            <w:vAlign w:val="center"/>
-            <w:tcMar>
-              <w:top w:w="90" w:type="dxa"/>
-              <w:start w:w="90" w:type="dxa"/>
-              <w:bottom w:w="90" w:type="dxa"/>
-              <w:end w:w="90" w:type="dxa"/>
-            </w:tcMar>
+            <w:tcW w:w="4176" w:type="dxa"/>
             <w:tcBorders>
               <w:top w:val="single" w:sz="6" w:space="0" w:color="D9E2DD"/>
               <w:left w:val="single" w:sz="6" w:space="0" w:color="D9E2DD"/>
               <w:bottom w:val="single" w:sz="6" w:space="0" w:color="D9E2DD"/>
               <w:right w:val="single" w:sz="6" w:space="0" w:color="D9E2DD"/>
-              <w:insideH w:val="single" w:sz="6" w:space="0" w:color="D9E2DD"/>
-              <w:insideV w:val="single" w:sz="6" w:space="0" w:color="D9E2DD"/>
-            </w:tcBorders>
-            <w:shd w:fill="1A5C38"/>
+            </w:tcBorders>
+            <w:shd w:val="clear" w:color="auto" w:fill="1A5C38"/>
+            <w:tcMar>
+              <w:top w:w="90" w:type="dxa"/>
+              <w:left w:w="90" w:type="dxa"/>
+              <w:bottom w:w="90" w:type="dxa"/>
+              <w:right w:w="90" w:type="dxa"/>
+            </w:tcMar>
+            <w:vAlign w:val="center"/>
           </w:tcPr>
           <w:p>
             <w:pPr>
-              <w:spacing w:after="0" w:line="259" w:lineRule="auto"/>
+              <w:spacing w:line="259" w:lineRule="auto"/>
               <w:jc w:val="center"/>
             </w:pPr>
             <w:r>
@@ -18643,26 +18657,24 @@
       <w:tr>
         <w:tc>
           <w:tcPr>
-            <w:tcW w:type="dxa" w:w="1080"/>
-            <w:vAlign w:val="center"/>
-            <w:tcMar>
-              <w:top w:w="90" w:type="dxa"/>
-              <w:start w:w="90" w:type="dxa"/>
-              <w:bottom w:w="90" w:type="dxa"/>
-              <w:end w:w="90" w:type="dxa"/>
-            </w:tcMar>
+            <w:tcW w:w="1080" w:type="dxa"/>
             <w:tcBorders>
               <w:top w:val="single" w:sz="6" w:space="0" w:color="D9E2DD"/>
               <w:left w:val="single" w:sz="6" w:space="0" w:color="D9E2DD"/>
               <w:bottom w:val="single" w:sz="6" w:space="0" w:color="D9E2DD"/>
               <w:right w:val="single" w:sz="6" w:space="0" w:color="D9E2DD"/>
-              <w:insideH w:val="single" w:sz="6" w:space="0" w:color="D9E2DD"/>
-              <w:insideV w:val="single" w:sz="6" w:space="0" w:color="D9E2DD"/>
-            </w:tcBorders>
+            </w:tcBorders>
+            <w:tcMar>
+              <w:top w:w="90" w:type="dxa"/>
+              <w:left w:w="90" w:type="dxa"/>
+              <w:bottom w:w="90" w:type="dxa"/>
+              <w:right w:w="90" w:type="dxa"/>
+            </w:tcMar>
+            <w:vAlign w:val="center"/>
           </w:tcPr>
           <w:p>
             <w:pPr>
-              <w:spacing w:after="0" w:line="259" w:lineRule="auto"/>
+              <w:spacing w:line="259" w:lineRule="auto"/>
             </w:pPr>
             <w:r>
               <w:rPr>
@@ -18674,26 +18686,24 @@
         </w:tc>
         <w:tc>
           <w:tcPr>
-            <w:tcW w:type="dxa" w:w="2592"/>
-            <w:vAlign w:val="center"/>
-            <w:tcMar>
-              <w:top w:w="90" w:type="dxa"/>
-              <w:start w:w="90" w:type="dxa"/>
-              <w:bottom w:w="90" w:type="dxa"/>
-              <w:end w:w="90" w:type="dxa"/>
-            </w:tcMar>
+            <w:tcW w:w="2592" w:type="dxa"/>
             <w:tcBorders>
               <w:top w:val="single" w:sz="6" w:space="0" w:color="D9E2DD"/>
               <w:left w:val="single" w:sz="6" w:space="0" w:color="D9E2DD"/>
               <w:bottom w:val="single" w:sz="6" w:space="0" w:color="D9E2DD"/>
               <w:right w:val="single" w:sz="6" w:space="0" w:color="D9E2DD"/>
-              <w:insideH w:val="single" w:sz="6" w:space="0" w:color="D9E2DD"/>
-              <w:insideV w:val="single" w:sz="6" w:space="0" w:color="D9E2DD"/>
-            </w:tcBorders>
+            </w:tcBorders>
+            <w:tcMar>
+              <w:top w:w="90" w:type="dxa"/>
+              <w:left w:w="90" w:type="dxa"/>
+              <w:bottom w:w="90" w:type="dxa"/>
+              <w:right w:w="90" w:type="dxa"/>
+            </w:tcMar>
+            <w:vAlign w:val="center"/>
           </w:tcPr>
           <w:p>
             <w:pPr>
-              <w:spacing w:after="0" w:line="259" w:lineRule="auto"/>
+              <w:spacing w:line="259" w:lineRule="auto"/>
             </w:pPr>
             <w:r>
               <w:rPr>
@@ -18705,26 +18715,24 @@
         </w:tc>
         <w:tc>
           <w:tcPr>
-            <w:tcW w:type="dxa" w:w="4392"/>
-            <w:vAlign w:val="center"/>
-            <w:tcMar>
-              <w:top w:w="90" w:type="dxa"/>
-              <w:start w:w="90" w:type="dxa"/>
-              <w:bottom w:w="90" w:type="dxa"/>
-              <w:end w:w="90" w:type="dxa"/>
-            </w:tcMar>
+            <w:tcW w:w="4392" w:type="dxa"/>
             <w:tcBorders>
               <w:top w:val="single" w:sz="6" w:space="0" w:color="D9E2DD"/>
               <w:left w:val="single" w:sz="6" w:space="0" w:color="D9E2DD"/>
               <w:bottom w:val="single" w:sz="6" w:space="0" w:color="D9E2DD"/>
               <w:right w:val="single" w:sz="6" w:space="0" w:color="D9E2DD"/>
-              <w:insideH w:val="single" w:sz="6" w:space="0" w:color="D9E2DD"/>
-              <w:insideV w:val="single" w:sz="6" w:space="0" w:color="D9E2DD"/>
-            </w:tcBorders>
+            </w:tcBorders>
+            <w:tcMar>
+              <w:top w:w="90" w:type="dxa"/>
+              <w:left w:w="90" w:type="dxa"/>
+              <w:bottom w:w="90" w:type="dxa"/>
+              <w:right w:w="90" w:type="dxa"/>
+            </w:tcMar>
+            <w:vAlign w:val="center"/>
           </w:tcPr>
           <w:p>
             <w:pPr>
-              <w:spacing w:after="0" w:line="259" w:lineRule="auto"/>
+              <w:spacing w:line="259" w:lineRule="auto"/>
             </w:pPr>
             <w:r>
               <w:rPr>
@@ -18736,26 +18744,24 @@
         </w:tc>
         <w:tc>
           <w:tcPr>
-            <w:tcW w:type="dxa" w:w="4176"/>
-            <w:vAlign w:val="center"/>
-            <w:tcMar>
-              <w:top w:w="90" w:type="dxa"/>
-              <w:start w:w="90" w:type="dxa"/>
-              <w:bottom w:w="90" w:type="dxa"/>
-              <w:end w:w="90" w:type="dxa"/>
-            </w:tcMar>
+            <w:tcW w:w="4176" w:type="dxa"/>
             <w:tcBorders>
               <w:top w:val="single" w:sz="6" w:space="0" w:color="D9E2DD"/>
               <w:left w:val="single" w:sz="6" w:space="0" w:color="D9E2DD"/>
               <w:bottom w:val="single" w:sz="6" w:space="0" w:color="D9E2DD"/>
               <w:right w:val="single" w:sz="6" w:space="0" w:color="D9E2DD"/>
-              <w:insideH w:val="single" w:sz="6" w:space="0" w:color="D9E2DD"/>
-              <w:insideV w:val="single" w:sz="6" w:space="0" w:color="D9E2DD"/>
-            </w:tcBorders>
+            </w:tcBorders>
+            <w:tcMar>
+              <w:top w:w="90" w:type="dxa"/>
+              <w:left w:w="90" w:type="dxa"/>
+              <w:bottom w:w="90" w:type="dxa"/>
+              <w:right w:w="90" w:type="dxa"/>
+            </w:tcMar>
+            <w:vAlign w:val="center"/>
           </w:tcPr>
           <w:p>
             <w:pPr>
-              <w:spacing w:after="0" w:line="259" w:lineRule="auto"/>
+              <w:spacing w:line="259" w:lineRule="auto"/>
             </w:pPr>
             <w:r>
               <w:rPr>
@@ -18769,26 +18775,24 @@
       <w:tr>
         <w:tc>
           <w:tcPr>
-            <w:tcW w:type="dxa" w:w="1080"/>
-            <w:vAlign w:val="center"/>
-            <w:tcMar>
-              <w:top w:w="90" w:type="dxa"/>
-              <w:start w:w="90" w:type="dxa"/>
-              <w:bottom w:w="90" w:type="dxa"/>
-              <w:end w:w="90" w:type="dxa"/>
-            </w:tcMar>
+            <w:tcW w:w="1080" w:type="dxa"/>
             <w:tcBorders>
               <w:top w:val="single" w:sz="6" w:space="0" w:color="D9E2DD"/>
               <w:left w:val="single" w:sz="6" w:space="0" w:color="D9E2DD"/>
               <w:bottom w:val="single" w:sz="6" w:space="0" w:color="D9E2DD"/>
               <w:right w:val="single" w:sz="6" w:space="0" w:color="D9E2DD"/>
-              <w:insideH w:val="single" w:sz="6" w:space="0" w:color="D9E2DD"/>
-              <w:insideV w:val="single" w:sz="6" w:space="0" w:color="D9E2DD"/>
-            </w:tcBorders>
+            </w:tcBorders>
+            <w:tcMar>
+              <w:top w:w="90" w:type="dxa"/>
+              <w:left w:w="90" w:type="dxa"/>
+              <w:bottom w:w="90" w:type="dxa"/>
+              <w:right w:w="90" w:type="dxa"/>
+            </w:tcMar>
+            <w:vAlign w:val="center"/>
           </w:tcPr>
           <w:p>
             <w:pPr>
-              <w:spacing w:after="0" w:line="259" w:lineRule="auto"/>
+              <w:spacing w:line="259" w:lineRule="auto"/>
             </w:pPr>
             <w:r>
               <w:rPr>
@@ -18800,26 +18804,24 @@
         </w:tc>
         <w:tc>
           <w:tcPr>
-            <w:tcW w:type="dxa" w:w="2592"/>
-            <w:vAlign w:val="center"/>
-            <w:tcMar>
-              <w:top w:w="90" w:type="dxa"/>
-              <w:start w:w="90" w:type="dxa"/>
-              <w:bottom w:w="90" w:type="dxa"/>
-              <w:end w:w="90" w:type="dxa"/>
-            </w:tcMar>
+            <w:tcW w:w="2592" w:type="dxa"/>
             <w:tcBorders>
               <w:top w:val="single" w:sz="6" w:space="0" w:color="D9E2DD"/>
               <w:left w:val="single" w:sz="6" w:space="0" w:color="D9E2DD"/>
               <w:bottom w:val="single" w:sz="6" w:space="0" w:color="D9E2DD"/>
               <w:right w:val="single" w:sz="6" w:space="0" w:color="D9E2DD"/>
-              <w:insideH w:val="single" w:sz="6" w:space="0" w:color="D9E2DD"/>
-              <w:insideV w:val="single" w:sz="6" w:space="0" w:color="D9E2DD"/>
-            </w:tcBorders>
+            </w:tcBorders>
+            <w:tcMar>
+              <w:top w:w="90" w:type="dxa"/>
+              <w:left w:w="90" w:type="dxa"/>
+              <w:bottom w:w="90" w:type="dxa"/>
+              <w:right w:w="90" w:type="dxa"/>
+            </w:tcMar>
+            <w:vAlign w:val="center"/>
           </w:tcPr>
           <w:p>
             <w:pPr>
-              <w:spacing w:after="0" w:line="259" w:lineRule="auto"/>
+              <w:spacing w:line="259" w:lineRule="auto"/>
             </w:pPr>
             <w:r>
               <w:rPr>
@@ -18831,26 +18833,24 @@
         </w:tc>
         <w:tc>
           <w:tcPr>
-            <w:tcW w:type="dxa" w:w="4392"/>
-            <w:vAlign w:val="center"/>
-            <w:tcMar>
-              <w:top w:w="90" w:type="dxa"/>
-              <w:start w:w="90" w:type="dxa"/>
-              <w:bottom w:w="90" w:type="dxa"/>
-              <w:end w:w="90" w:type="dxa"/>
-            </w:tcMar>
+            <w:tcW w:w="4392" w:type="dxa"/>
             <w:tcBorders>
               <w:top w:val="single" w:sz="6" w:space="0" w:color="D9E2DD"/>
               <w:left w:val="single" w:sz="6" w:space="0" w:color="D9E2DD"/>
               <w:bottom w:val="single" w:sz="6" w:space="0" w:color="D9E2DD"/>
               <w:right w:val="single" w:sz="6" w:space="0" w:color="D9E2DD"/>
-              <w:insideH w:val="single" w:sz="6" w:space="0" w:color="D9E2DD"/>
-              <w:insideV w:val="single" w:sz="6" w:space="0" w:color="D9E2DD"/>
-            </w:tcBorders>
+            </w:tcBorders>
+            <w:tcMar>
+              <w:top w:w="90" w:type="dxa"/>
+              <w:left w:w="90" w:type="dxa"/>
+              <w:bottom w:w="90" w:type="dxa"/>
+              <w:right w:w="90" w:type="dxa"/>
+            </w:tcMar>
+            <w:vAlign w:val="center"/>
           </w:tcPr>
           <w:p>
             <w:pPr>
-              <w:spacing w:after="0" w:line="259" w:lineRule="auto"/>
+              <w:spacing w:line="259" w:lineRule="auto"/>
             </w:pPr>
             <w:r>
               <w:rPr>
@@ -18862,26 +18862,24 @@
         </w:tc>
         <w:tc>
           <w:tcPr>
-            <w:tcW w:type="dxa" w:w="4176"/>
-            <w:vAlign w:val="center"/>
-            <w:tcMar>
-              <w:top w:w="90" w:type="dxa"/>
-              <w:start w:w="90" w:type="dxa"/>
-              <w:bottom w:w="90" w:type="dxa"/>
-              <w:end w:w="90" w:type="dxa"/>
-            </w:tcMar>
+            <w:tcW w:w="4176" w:type="dxa"/>
             <w:tcBorders>
               <w:top w:val="single" w:sz="6" w:space="0" w:color="D9E2DD"/>
               <w:left w:val="single" w:sz="6" w:space="0" w:color="D9E2DD"/>
               <w:bottom w:val="single" w:sz="6" w:space="0" w:color="D9E2DD"/>
               <w:right w:val="single" w:sz="6" w:space="0" w:color="D9E2DD"/>
-              <w:insideH w:val="single" w:sz="6" w:space="0" w:color="D9E2DD"/>
-              <w:insideV w:val="single" w:sz="6" w:space="0" w:color="D9E2DD"/>
-            </w:tcBorders>
+            </w:tcBorders>
+            <w:tcMar>
+              <w:top w:w="90" w:type="dxa"/>
+              <w:left w:w="90" w:type="dxa"/>
+              <w:bottom w:w="90" w:type="dxa"/>
+              <w:right w:w="90" w:type="dxa"/>
+            </w:tcMar>
+            <w:vAlign w:val="center"/>
           </w:tcPr>
           <w:p>
             <w:pPr>
-              <w:spacing w:after="0" w:line="259" w:lineRule="auto"/>
+              <w:spacing w:line="259" w:lineRule="auto"/>
             </w:pPr>
             <w:r>
               <w:rPr>
@@ -18895,26 +18893,24 @@
       <w:tr>
         <w:tc>
           <w:tcPr>
-            <w:tcW w:type="dxa" w:w="1080"/>
-            <w:vAlign w:val="center"/>
-            <w:tcMar>
-              <w:top w:w="90" w:type="dxa"/>
-              <w:start w:w="90" w:type="dxa"/>
-              <w:bottom w:w="90" w:type="dxa"/>
-              <w:end w:w="90" w:type="dxa"/>
-            </w:tcMar>
+            <w:tcW w:w="1080" w:type="dxa"/>
             <w:tcBorders>
               <w:top w:val="single" w:sz="6" w:space="0" w:color="D9E2DD"/>
               <w:left w:val="single" w:sz="6" w:space="0" w:color="D9E2DD"/>
               <w:bottom w:val="single" w:sz="6" w:space="0" w:color="D9E2DD"/>
               <w:right w:val="single" w:sz="6" w:space="0" w:color="D9E2DD"/>
-              <w:insideH w:val="single" w:sz="6" w:space="0" w:color="D9E2DD"/>
-              <w:insideV w:val="single" w:sz="6" w:space="0" w:color="D9E2DD"/>
-            </w:tcBorders>
+            </w:tcBorders>
+            <w:tcMar>
+              <w:top w:w="90" w:type="dxa"/>
+              <w:left w:w="90" w:type="dxa"/>
+              <w:bottom w:w="90" w:type="dxa"/>
+              <w:right w:w="90" w:type="dxa"/>
+            </w:tcMar>
+            <w:vAlign w:val="center"/>
           </w:tcPr>
           <w:p>
             <w:pPr>
-              <w:spacing w:after="0" w:line="259" w:lineRule="auto"/>
+              <w:spacing w:line="259" w:lineRule="auto"/>
             </w:pPr>
             <w:r>
               <w:rPr>
@@ -18926,26 +18922,24 @@
         </w:tc>
         <w:tc>
           <w:tcPr>
-            <w:tcW w:type="dxa" w:w="2592"/>
-            <w:vAlign w:val="center"/>
-            <w:tcMar>
-              <w:top w:w="90" w:type="dxa"/>
-              <w:start w:w="90" w:type="dxa"/>
-              <w:bottom w:w="90" w:type="dxa"/>
-              <w:end w:w="90" w:type="dxa"/>
-            </w:tcMar>
+            <w:tcW w:w="2592" w:type="dxa"/>
             <w:tcBorders>
               <w:top w:val="single" w:sz="6" w:space="0" w:color="D9E2DD"/>
               <w:left w:val="single" w:sz="6" w:space="0" w:color="D9E2DD"/>
               <w:bottom w:val="single" w:sz="6" w:space="0" w:color="D9E2DD"/>
               <w:right w:val="single" w:sz="6" w:space="0" w:color="D9E2DD"/>
-              <w:insideH w:val="single" w:sz="6" w:space="0" w:color="D9E2DD"/>
-              <w:insideV w:val="single" w:sz="6" w:space="0" w:color="D9E2DD"/>
-            </w:tcBorders>
+            </w:tcBorders>
+            <w:tcMar>
+              <w:top w:w="90" w:type="dxa"/>
+              <w:left w:w="90" w:type="dxa"/>
+              <w:bottom w:w="90" w:type="dxa"/>
+              <w:right w:w="90" w:type="dxa"/>
+            </w:tcMar>
+            <w:vAlign w:val="center"/>
           </w:tcPr>
           <w:p>
             <w:pPr>
-              <w:spacing w:after="0" w:line="259" w:lineRule="auto"/>
+              <w:spacing w:line="259" w:lineRule="auto"/>
             </w:pPr>
             <w:r>
               <w:rPr>
@@ -18957,26 +18951,24 @@
         </w:tc>
         <w:tc>
           <w:tcPr>
-            <w:tcW w:type="dxa" w:w="4392"/>
-            <w:vAlign w:val="center"/>
-            <w:tcMar>
-              <w:top w:w="90" w:type="dxa"/>
-              <w:start w:w="90" w:type="dxa"/>
-              <w:bottom w:w="90" w:type="dxa"/>
-              <w:end w:w="90" w:type="dxa"/>
-            </w:tcMar>
+            <w:tcW w:w="4392" w:type="dxa"/>
             <w:tcBorders>
               <w:top w:val="single" w:sz="6" w:space="0" w:color="D9E2DD"/>
               <w:left w:val="single" w:sz="6" w:space="0" w:color="D9E2DD"/>
               <w:bottom w:val="single" w:sz="6" w:space="0" w:color="D9E2DD"/>
               <w:right w:val="single" w:sz="6" w:space="0" w:color="D9E2DD"/>
-              <w:insideH w:val="single" w:sz="6" w:space="0" w:color="D9E2DD"/>
-              <w:insideV w:val="single" w:sz="6" w:space="0" w:color="D9E2DD"/>
-            </w:tcBorders>
+            </w:tcBorders>
+            <w:tcMar>
+              <w:top w:w="90" w:type="dxa"/>
+              <w:left w:w="90" w:type="dxa"/>
+              <w:bottom w:w="90" w:type="dxa"/>
+              <w:right w:w="90" w:type="dxa"/>
+            </w:tcMar>
+            <w:vAlign w:val="center"/>
           </w:tcPr>
           <w:p>
             <w:pPr>
-              <w:spacing w:after="0" w:line="259" w:lineRule="auto"/>
+              <w:spacing w:line="259" w:lineRule="auto"/>
             </w:pPr>
             <w:r>
               <w:rPr>
@@ -18988,26 +18980,24 @@
         </w:tc>
         <w:tc>
           <w:tcPr>
-            <w:tcW w:type="dxa" w:w="4176"/>
-            <w:vAlign w:val="center"/>
-            <w:tcMar>
-              <w:top w:w="90" w:type="dxa"/>
-              <w:start w:w="90" w:type="dxa"/>
-              <w:bottom w:w="90" w:type="dxa"/>
-              <w:end w:w="90" w:type="dxa"/>
-            </w:tcMar>
+            <w:tcW w:w="4176" w:type="dxa"/>
             <w:tcBorders>
               <w:top w:val="single" w:sz="6" w:space="0" w:color="D9E2DD"/>
               <w:left w:val="single" w:sz="6" w:space="0" w:color="D9E2DD"/>
               <w:bottom w:val="single" w:sz="6" w:space="0" w:color="D9E2DD"/>
               <w:right w:val="single" w:sz="6" w:space="0" w:color="D9E2DD"/>
-              <w:insideH w:val="single" w:sz="6" w:space="0" w:color="D9E2DD"/>
-              <w:insideV w:val="single" w:sz="6" w:space="0" w:color="D9E2DD"/>
-            </w:tcBorders>
+            </w:tcBorders>
+            <w:tcMar>
+              <w:top w:w="90" w:type="dxa"/>
+              <w:left w:w="90" w:type="dxa"/>
+              <w:bottom w:w="90" w:type="dxa"/>
+              <w:right w:w="90" w:type="dxa"/>
+            </w:tcMar>
+            <w:vAlign w:val="center"/>
           </w:tcPr>
           <w:p>
             <w:pPr>
-              <w:spacing w:after="0" w:line="259" w:lineRule="auto"/>
+              <w:spacing w:line="259" w:lineRule="auto"/>
             </w:pPr>
             <w:r>
               <w:rPr>
@@ -19021,26 +19011,24 @@
       <w:tr>
         <w:tc>
           <w:tcPr>
-            <w:tcW w:type="dxa" w:w="1080"/>
-            <w:vAlign w:val="center"/>
-            <w:tcMar>
-              <w:top w:w="90" w:type="dxa"/>
-              <w:start w:w="90" w:type="dxa"/>
-              <w:bottom w:w="90" w:type="dxa"/>
-              <w:end w:w="90" w:type="dxa"/>
-            </w:tcMar>
+            <w:tcW w:w="1080" w:type="dxa"/>
             <w:tcBorders>
               <w:top w:val="single" w:sz="6" w:space="0" w:color="D9E2DD"/>
               <w:left w:val="single" w:sz="6" w:space="0" w:color="D9E2DD"/>
               <w:bottom w:val="single" w:sz="6" w:space="0" w:color="D9E2DD"/>
               <w:right w:val="single" w:sz="6" w:space="0" w:color="D9E2DD"/>
-              <w:insideH w:val="single" w:sz="6" w:space="0" w:color="D9E2DD"/>
-              <w:insideV w:val="single" w:sz="6" w:space="0" w:color="D9E2DD"/>
-            </w:tcBorders>
+            </w:tcBorders>
+            <w:tcMar>
+              <w:top w:w="90" w:type="dxa"/>
+              <w:left w:w="90" w:type="dxa"/>
+              <w:bottom w:w="90" w:type="dxa"/>
+              <w:right w:w="90" w:type="dxa"/>
+            </w:tcMar>
+            <w:vAlign w:val="center"/>
           </w:tcPr>
           <w:p>
             <w:pPr>
-              <w:spacing w:after="0" w:line="259" w:lineRule="auto"/>
+              <w:spacing w:line="259" w:lineRule="auto"/>
             </w:pPr>
             <w:r>
               <w:rPr>
@@ -19052,26 +19040,24 @@
         </w:tc>
         <w:tc>
           <w:tcPr>
-            <w:tcW w:type="dxa" w:w="2592"/>
-            <w:vAlign w:val="center"/>
-            <w:tcMar>
-              <w:top w:w="90" w:type="dxa"/>
-              <w:start w:w="90" w:type="dxa"/>
-              <w:bottom w:w="90" w:type="dxa"/>
-              <w:end w:w="90" w:type="dxa"/>
-            </w:tcMar>
+            <w:tcW w:w="2592" w:type="dxa"/>
             <w:tcBorders>
               <w:top w:val="single" w:sz="6" w:space="0" w:color="D9E2DD"/>
               <w:left w:val="single" w:sz="6" w:space="0" w:color="D9E2DD"/>
               <w:bottom w:val="single" w:sz="6" w:space="0" w:color="D9E2DD"/>
               <w:right w:val="single" w:sz="6" w:space="0" w:color="D9E2DD"/>
-              <w:insideH w:val="single" w:sz="6" w:space="0" w:color="D9E2DD"/>
-              <w:insideV w:val="single" w:sz="6" w:space="0" w:color="D9E2DD"/>
-            </w:tcBorders>
+            </w:tcBorders>
+            <w:tcMar>
+              <w:top w:w="90" w:type="dxa"/>
+              <w:left w:w="90" w:type="dxa"/>
+              <w:bottom w:w="90" w:type="dxa"/>
+              <w:right w:w="90" w:type="dxa"/>
+            </w:tcMar>
+            <w:vAlign w:val="center"/>
           </w:tcPr>
           <w:p>
             <w:pPr>
-              <w:spacing w:after="0" w:line="259" w:lineRule="auto"/>
+              <w:spacing w:line="259" w:lineRule="auto"/>
             </w:pPr>
             <w:r>
               <w:rPr>
@@ -19083,26 +19069,24 @@
         </w:tc>
         <w:tc>
           <w:tcPr>
-            <w:tcW w:type="dxa" w:w="4392"/>
-            <w:vAlign w:val="center"/>
-            <w:tcMar>
-              <w:top w:w="90" w:type="dxa"/>
-              <w:start w:w="90" w:type="dxa"/>
-              <w:bottom w:w="90" w:type="dxa"/>
-              <w:end w:w="90" w:type="dxa"/>
-            </w:tcMar>
+            <w:tcW w:w="4392" w:type="dxa"/>
             <w:tcBorders>
               <w:top w:val="single" w:sz="6" w:space="0" w:color="D9E2DD"/>
               <w:left w:val="single" w:sz="6" w:space="0" w:color="D9E2DD"/>
               <w:bottom w:val="single" w:sz="6" w:space="0" w:color="D9E2DD"/>
               <w:right w:val="single" w:sz="6" w:space="0" w:color="D9E2DD"/>
-              <w:insideH w:val="single" w:sz="6" w:space="0" w:color="D9E2DD"/>
-              <w:insideV w:val="single" w:sz="6" w:space="0" w:color="D9E2DD"/>
-            </w:tcBorders>
+            </w:tcBorders>
+            <w:tcMar>
+              <w:top w:w="90" w:type="dxa"/>
+              <w:left w:w="90" w:type="dxa"/>
+              <w:bottom w:w="90" w:type="dxa"/>
+              <w:right w:w="90" w:type="dxa"/>
+            </w:tcMar>
+            <w:vAlign w:val="center"/>
           </w:tcPr>
           <w:p>
             <w:pPr>
-              <w:spacing w:after="0" w:line="259" w:lineRule="auto"/>
+              <w:spacing w:line="259" w:lineRule="auto"/>
             </w:pPr>
             <w:r>
               <w:rPr>
@@ -19114,26 +19098,24 @@
         </w:tc>
         <w:tc>
           <w:tcPr>
-            <w:tcW w:type="dxa" w:w="4176"/>
-            <w:vAlign w:val="center"/>
-            <w:tcMar>
-              <w:top w:w="90" w:type="dxa"/>
-              <w:start w:w="90" w:type="dxa"/>
-              <w:bottom w:w="90" w:type="dxa"/>
-              <w:end w:w="90" w:type="dxa"/>
-            </w:tcMar>
+            <w:tcW w:w="4176" w:type="dxa"/>
             <w:tcBorders>
               <w:top w:val="single" w:sz="6" w:space="0" w:color="D9E2DD"/>
               <w:left w:val="single" w:sz="6" w:space="0" w:color="D9E2DD"/>
               <w:bottom w:val="single" w:sz="6" w:space="0" w:color="D9E2DD"/>
               <w:right w:val="single" w:sz="6" w:space="0" w:color="D9E2DD"/>
-              <w:insideH w:val="single" w:sz="6" w:space="0" w:color="D9E2DD"/>
-              <w:insideV w:val="single" w:sz="6" w:space="0" w:color="D9E2DD"/>
-            </w:tcBorders>
+            </w:tcBorders>
+            <w:tcMar>
+              <w:top w:w="90" w:type="dxa"/>
+              <w:left w:w="90" w:type="dxa"/>
+              <w:bottom w:w="90" w:type="dxa"/>
+              <w:right w:w="90" w:type="dxa"/>
+            </w:tcMar>
+            <w:vAlign w:val="center"/>
           </w:tcPr>
           <w:p>
             <w:pPr>
-              <w:spacing w:after="0" w:line="259" w:lineRule="auto"/>
+              <w:spacing w:line="259" w:lineRule="auto"/>
             </w:pPr>
             <w:r>
               <w:rPr>
@@ -19147,26 +19129,24 @@
       <w:tr>
         <w:tc>
           <w:tcPr>
-            <w:tcW w:type="dxa" w:w="1080"/>
-            <w:vAlign w:val="center"/>
-            <w:tcMar>
-              <w:top w:w="90" w:type="dxa"/>
-              <w:start w:w="90" w:type="dxa"/>
-              <w:bottom w:w="90" w:type="dxa"/>
-              <w:end w:w="90" w:type="dxa"/>
-            </w:tcMar>
+            <w:tcW w:w="1080" w:type="dxa"/>
             <w:tcBorders>
               <w:top w:val="single" w:sz="6" w:space="0" w:color="D9E2DD"/>
               <w:left w:val="single" w:sz="6" w:space="0" w:color="D9E2DD"/>
               <w:bottom w:val="single" w:sz="6" w:space="0" w:color="D9E2DD"/>
               <w:right w:val="single" w:sz="6" w:space="0" w:color="D9E2DD"/>
-              <w:insideH w:val="single" w:sz="6" w:space="0" w:color="D9E2DD"/>
-              <w:insideV w:val="single" w:sz="6" w:space="0" w:color="D9E2DD"/>
-            </w:tcBorders>
+            </w:tcBorders>
+            <w:tcMar>
+              <w:top w:w="90" w:type="dxa"/>
+              <w:left w:w="90" w:type="dxa"/>
+              <w:bottom w:w="90" w:type="dxa"/>
+              <w:right w:w="90" w:type="dxa"/>
+            </w:tcMar>
+            <w:vAlign w:val="center"/>
           </w:tcPr>
           <w:p>
             <w:pPr>
-              <w:spacing w:after="0" w:line="259" w:lineRule="auto"/>
+              <w:spacing w:line="259" w:lineRule="auto"/>
             </w:pPr>
             <w:r>
               <w:rPr>
@@ -19178,26 +19158,24 @@
         </w:tc>
         <w:tc>
           <w:tcPr>
-            <w:tcW w:type="dxa" w:w="2592"/>
-            <w:vAlign w:val="center"/>
-            <w:tcMar>
-              <w:top w:w="90" w:type="dxa"/>
-              <w:start w:w="90" w:type="dxa"/>
-              <w:bottom w:w="90" w:type="dxa"/>
-              <w:end w:w="90" w:type="dxa"/>
-            </w:tcMar>
+            <w:tcW w:w="2592" w:type="dxa"/>
             <w:tcBorders>
               <w:top w:val="single" w:sz="6" w:space="0" w:color="D9E2DD"/>
               <w:left w:val="single" w:sz="6" w:space="0" w:color="D9E2DD"/>
               <w:bottom w:val="single" w:sz="6" w:space="0" w:color="D9E2DD"/>
               <w:right w:val="single" w:sz="6" w:space="0" w:color="D9E2DD"/>
-              <w:insideH w:val="single" w:sz="6" w:space="0" w:color="D9E2DD"/>
-              <w:insideV w:val="single" w:sz="6" w:space="0" w:color="D9E2DD"/>
-            </w:tcBorders>
+            </w:tcBorders>
+            <w:tcMar>
+              <w:top w:w="90" w:type="dxa"/>
+              <w:left w:w="90" w:type="dxa"/>
+              <w:bottom w:w="90" w:type="dxa"/>
+              <w:right w:w="90" w:type="dxa"/>
+            </w:tcMar>
+            <w:vAlign w:val="center"/>
           </w:tcPr>
           <w:p>
             <w:pPr>
-              <w:spacing w:after="0" w:line="259" w:lineRule="auto"/>
+              <w:spacing w:line="259" w:lineRule="auto"/>
             </w:pPr>
             <w:r>
               <w:rPr>
@@ -19209,26 +19187,24 @@
         </w:tc>
         <w:tc>
           <w:tcPr>
-            <w:tcW w:type="dxa" w:w="4392"/>
-            <w:vAlign w:val="center"/>
-            <w:tcMar>
-              <w:top w:w="90" w:type="dxa"/>
-              <w:start w:w="90" w:type="dxa"/>
-              <w:bottom w:w="90" w:type="dxa"/>
-              <w:end w:w="90" w:type="dxa"/>
-            </w:tcMar>
+            <w:tcW w:w="4392" w:type="dxa"/>
             <w:tcBorders>
               <w:top w:val="single" w:sz="6" w:space="0" w:color="D9E2DD"/>
               <w:left w:val="single" w:sz="6" w:space="0" w:color="D9E2DD"/>
               <w:bottom w:val="single" w:sz="6" w:space="0" w:color="D9E2DD"/>
               <w:right w:val="single" w:sz="6" w:space="0" w:color="D9E2DD"/>
-              <w:insideH w:val="single" w:sz="6" w:space="0" w:color="D9E2DD"/>
-              <w:insideV w:val="single" w:sz="6" w:space="0" w:color="D9E2DD"/>
-            </w:tcBorders>
+            </w:tcBorders>
+            <w:tcMar>
+              <w:top w:w="90" w:type="dxa"/>
+              <w:left w:w="90" w:type="dxa"/>
+              <w:bottom w:w="90" w:type="dxa"/>
+              <w:right w:w="90" w:type="dxa"/>
+            </w:tcMar>
+            <w:vAlign w:val="center"/>
           </w:tcPr>
           <w:p>
             <w:pPr>
-              <w:spacing w:after="0" w:line="259" w:lineRule="auto"/>
+              <w:spacing w:line="259" w:lineRule="auto"/>
             </w:pPr>
             <w:r>
               <w:rPr>
@@ -19240,26 +19216,24 @@
         </w:tc>
         <w:tc>
           <w:tcPr>
-            <w:tcW w:type="dxa" w:w="4176"/>
-            <w:vAlign w:val="center"/>
-            <w:tcMar>
-              <w:top w:w="90" w:type="dxa"/>
-              <w:start w:w="90" w:type="dxa"/>
-              <w:bottom w:w="90" w:type="dxa"/>
-              <w:end w:w="90" w:type="dxa"/>
-            </w:tcMar>
+            <w:tcW w:w="4176" w:type="dxa"/>
             <w:tcBorders>
               <w:top w:val="single" w:sz="6" w:space="0" w:color="D9E2DD"/>
               <w:left w:val="single" w:sz="6" w:space="0" w:color="D9E2DD"/>
               <w:bottom w:val="single" w:sz="6" w:space="0" w:color="D9E2DD"/>
               <w:right w:val="single" w:sz="6" w:space="0" w:color="D9E2DD"/>
-              <w:insideH w:val="single" w:sz="6" w:space="0" w:color="D9E2DD"/>
-              <w:insideV w:val="single" w:sz="6" w:space="0" w:color="D9E2DD"/>
-            </w:tcBorders>
+            </w:tcBorders>
+            <w:tcMar>
+              <w:top w:w="90" w:type="dxa"/>
+              <w:left w:w="90" w:type="dxa"/>
+              <w:bottom w:w="90" w:type="dxa"/>
+              <w:right w:w="90" w:type="dxa"/>
+            </w:tcMar>
+            <w:vAlign w:val="center"/>
           </w:tcPr>
           <w:p>
             <w:pPr>
-              <w:spacing w:after="0" w:line="259" w:lineRule="auto"/>
+              <w:spacing w:line="259" w:lineRule="auto"/>
             </w:pPr>
             <w:r>
               <w:rPr>
@@ -19273,26 +19247,24 @@
       <w:tr>
         <w:tc>
           <w:tcPr>
-            <w:tcW w:type="dxa" w:w="1080"/>
-            <w:vAlign w:val="center"/>
-            <w:tcMar>
-              <w:top w:w="90" w:type="dxa"/>
-              <w:start w:w="90" w:type="dxa"/>
-              <w:bottom w:w="90" w:type="dxa"/>
-              <w:end w:w="90" w:type="dxa"/>
-            </w:tcMar>
+            <w:tcW w:w="1080" w:type="dxa"/>
             <w:tcBorders>
               <w:top w:val="single" w:sz="6" w:space="0" w:color="D9E2DD"/>
               <w:left w:val="single" w:sz="6" w:space="0" w:color="D9E2DD"/>
               <w:bottom w:val="single" w:sz="6" w:space="0" w:color="D9E2DD"/>
               <w:right w:val="single" w:sz="6" w:space="0" w:color="D9E2DD"/>
-              <w:insideH w:val="single" w:sz="6" w:space="0" w:color="D9E2DD"/>
-              <w:insideV w:val="single" w:sz="6" w:space="0" w:color="D9E2DD"/>
-            </w:tcBorders>
+            </w:tcBorders>
+            <w:tcMar>
+              <w:top w:w="90" w:type="dxa"/>
+              <w:left w:w="90" w:type="dxa"/>
+              <w:bottom w:w="90" w:type="dxa"/>
+              <w:right w:w="90" w:type="dxa"/>
+            </w:tcMar>
+            <w:vAlign w:val="center"/>
           </w:tcPr>
           <w:p>
             <w:pPr>
-              <w:spacing w:after="0" w:line="259" w:lineRule="auto"/>
+              <w:spacing w:line="259" w:lineRule="auto"/>
             </w:pPr>
             <w:r>
               <w:rPr>
@@ -19304,26 +19276,24 @@
         </w:tc>
         <w:tc>
           <w:tcPr>
-            <w:tcW w:type="dxa" w:w="2592"/>
-            <w:vAlign w:val="center"/>
-            <w:tcMar>
-              <w:top w:w="90" w:type="dxa"/>
-              <w:start w:w="90" w:type="dxa"/>
-              <w:bottom w:w="90" w:type="dxa"/>
-              <w:end w:w="90" w:type="dxa"/>
-            </w:tcMar>
+            <w:tcW w:w="2592" w:type="dxa"/>
             <w:tcBorders>
               <w:top w:val="single" w:sz="6" w:space="0" w:color="D9E2DD"/>
               <w:left w:val="single" w:sz="6" w:space="0" w:color="D9E2DD"/>
               <w:bottom w:val="single" w:sz="6" w:space="0" w:color="D9E2DD"/>
               <w:right w:val="single" w:sz="6" w:space="0" w:color="D9E2DD"/>
-              <w:insideH w:val="single" w:sz="6" w:space="0" w:color="D9E2DD"/>
-              <w:insideV w:val="single" w:sz="6" w:space="0" w:color="D9E2DD"/>
-            </w:tcBorders>
+            </w:tcBorders>
+            <w:tcMar>
+              <w:top w:w="90" w:type="dxa"/>
+              <w:left w:w="90" w:type="dxa"/>
+              <w:bottom w:w="90" w:type="dxa"/>
+              <w:right w:w="90" w:type="dxa"/>
+            </w:tcMar>
+            <w:vAlign w:val="center"/>
           </w:tcPr>
           <w:p>
             <w:pPr>
-              <w:spacing w:after="0" w:line="259" w:lineRule="auto"/>
+              <w:spacing w:line="259" w:lineRule="auto"/>
             </w:pPr>
             <w:r>
               <w:rPr>
@@ -19335,26 +19305,24 @@
         </w:tc>
         <w:tc>
           <w:tcPr>
-            <w:tcW w:type="dxa" w:w="4392"/>
-            <w:vAlign w:val="center"/>
-            <w:tcMar>
-              <w:top w:w="90" w:type="dxa"/>
-              <w:start w:w="90" w:type="dxa"/>
-              <w:bottom w:w="90" w:type="dxa"/>
-              <w:end w:w="90" w:type="dxa"/>
-            </w:tcMar>
+            <w:tcW w:w="4392" w:type="dxa"/>
             <w:tcBorders>
               <w:top w:val="single" w:sz="6" w:space="0" w:color="D9E2DD"/>
               <w:left w:val="single" w:sz="6" w:space="0" w:color="D9E2DD"/>
               <w:bottom w:val="single" w:sz="6" w:space="0" w:color="D9E2DD"/>
               <w:right w:val="single" w:sz="6" w:space="0" w:color="D9E2DD"/>
-              <w:insideH w:val="single" w:sz="6" w:space="0" w:color="D9E2DD"/>
-              <w:insideV w:val="single" w:sz="6" w:space="0" w:color="D9E2DD"/>
-            </w:tcBorders>
+            </w:tcBorders>
+            <w:tcMar>
+              <w:top w:w="90" w:type="dxa"/>
+              <w:left w:w="90" w:type="dxa"/>
+              <w:bottom w:w="90" w:type="dxa"/>
+              <w:right w:w="90" w:type="dxa"/>
+            </w:tcMar>
+            <w:vAlign w:val="center"/>
           </w:tcPr>
           <w:p>
             <w:pPr>
-              <w:spacing w:after="0" w:line="259" w:lineRule="auto"/>
+              <w:spacing w:line="259" w:lineRule="auto"/>
             </w:pPr>
             <w:r>
               <w:rPr>
@@ -19366,26 +19334,24 @@
         </w:tc>
         <w:tc>
           <w:tcPr>
-            <w:tcW w:type="dxa" w:w="4176"/>
-            <w:vAlign w:val="center"/>
-            <w:tcMar>
-              <w:top w:w="90" w:type="dxa"/>
-              <w:start w:w="90" w:type="dxa"/>
-              <w:bottom w:w="90" w:type="dxa"/>
-              <w:end w:w="90" w:type="dxa"/>
-            </w:tcMar>
+            <w:tcW w:w="4176" w:type="dxa"/>
             <w:tcBorders>
               <w:top w:val="single" w:sz="6" w:space="0" w:color="D9E2DD"/>
               <w:left w:val="single" w:sz="6" w:space="0" w:color="D9E2DD"/>
               <w:bottom w:val="single" w:sz="6" w:space="0" w:color="D9E2DD"/>
               <w:right w:val="single" w:sz="6" w:space="0" w:color="D9E2DD"/>
-              <w:insideH w:val="single" w:sz="6" w:space="0" w:color="D9E2DD"/>
-              <w:insideV w:val="single" w:sz="6" w:space="0" w:color="D9E2DD"/>
-            </w:tcBorders>
+            </w:tcBorders>
+            <w:tcMar>
+              <w:top w:w="90" w:type="dxa"/>
+              <w:left w:w="90" w:type="dxa"/>
+              <w:bottom w:w="90" w:type="dxa"/>
+              <w:right w:w="90" w:type="dxa"/>
+            </w:tcMar>
+            <w:vAlign w:val="center"/>
           </w:tcPr>
           <w:p>
             <w:pPr>
-              <w:spacing w:after="0" w:line="259" w:lineRule="auto"/>
+              <w:spacing w:line="259" w:lineRule="auto"/>
             </w:pPr>
             <w:r>
               <w:rPr>
@@ -19410,38 +19376,36 @@
     </w:p>
     <w:tbl>
       <w:tblPr>
-        <w:tblW w:type="auto" w:w="0"/>
+        <w:tblW w:w="0" w:type="auto"/>
         <w:tblLayout w:type="fixed"/>
-        <w:tblLook w:firstColumn="1" w:firstRow="1" w:lastColumn="0" w:lastRow="0" w:noHBand="0" w:noVBand="1" w:val="04A0"/>
+        <w:tblLook w:val="04A0" w:firstRow="1" w:lastRow="0" w:firstColumn="1" w:lastColumn="0" w:noHBand="0" w:noVBand="1"/>
       </w:tblPr>
       <w:tblGrid>
-        <w:gridCol w:w="4680"/>
-        <w:gridCol w:w="4680"/>
+        <w:gridCol w:w="3168"/>
+        <w:gridCol w:w="9072"/>
       </w:tblGrid>
       <w:tr>
         <w:tc>
           <w:tcPr>
-            <w:tcW w:type="dxa" w:w="3168"/>
-            <w:vAlign w:val="center"/>
-            <w:tcMar>
-              <w:top w:w="90" w:type="dxa"/>
-              <w:start w:w="90" w:type="dxa"/>
-              <w:bottom w:w="90" w:type="dxa"/>
-              <w:end w:w="90" w:type="dxa"/>
-            </w:tcMar>
+            <w:tcW w:w="3168" w:type="dxa"/>
             <w:tcBorders>
               <w:top w:val="single" w:sz="6" w:space="0" w:color="D9E2DD"/>
               <w:left w:val="single" w:sz="6" w:space="0" w:color="D9E2DD"/>
               <w:bottom w:val="single" w:sz="6" w:space="0" w:color="D9E2DD"/>
               <w:right w:val="single" w:sz="6" w:space="0" w:color="D9E2DD"/>
-              <w:insideH w:val="single" w:sz="6" w:space="0" w:color="D9E2DD"/>
-              <w:insideV w:val="single" w:sz="6" w:space="0" w:color="D9E2DD"/>
-            </w:tcBorders>
-            <w:shd w:fill="FF6B35"/>
+            </w:tcBorders>
+            <w:shd w:val="clear" w:color="auto" w:fill="FF6B35"/>
+            <w:tcMar>
+              <w:top w:w="90" w:type="dxa"/>
+              <w:left w:w="90" w:type="dxa"/>
+              <w:bottom w:w="90" w:type="dxa"/>
+              <w:right w:w="90" w:type="dxa"/>
+            </w:tcMar>
+            <w:vAlign w:val="center"/>
           </w:tcPr>
           <w:p>
             <w:pPr>
-              <w:spacing w:after="0" w:line="259" w:lineRule="auto"/>
+              <w:spacing w:line="259" w:lineRule="auto"/>
               <w:jc w:val="center"/>
             </w:pPr>
             <w:r>
@@ -19456,27 +19420,25 @@
         </w:tc>
         <w:tc>
           <w:tcPr>
-            <w:tcW w:type="dxa" w:w="9072"/>
-            <w:vAlign w:val="center"/>
-            <w:tcMar>
-              <w:top w:w="90" w:type="dxa"/>
-              <w:start w:w="90" w:type="dxa"/>
-              <w:bottom w:w="90" w:type="dxa"/>
-              <w:end w:w="90" w:type="dxa"/>
-            </w:tcMar>
+            <w:tcW w:w="9072" w:type="dxa"/>
             <w:tcBorders>
               <w:top w:val="single" w:sz="6" w:space="0" w:color="D9E2DD"/>
               <w:left w:val="single" w:sz="6" w:space="0" w:color="D9E2DD"/>
               <w:bottom w:val="single" w:sz="6" w:space="0" w:color="D9E2DD"/>
               <w:right w:val="single" w:sz="6" w:space="0" w:color="D9E2DD"/>
-              <w:insideH w:val="single" w:sz="6" w:space="0" w:color="D9E2DD"/>
-              <w:insideV w:val="single" w:sz="6" w:space="0" w:color="D9E2DD"/>
-            </w:tcBorders>
-            <w:shd w:fill="FF6B35"/>
+            </w:tcBorders>
+            <w:shd w:val="clear" w:color="auto" w:fill="FF6B35"/>
+            <w:tcMar>
+              <w:top w:w="90" w:type="dxa"/>
+              <w:left w:w="90" w:type="dxa"/>
+              <w:bottom w:w="90" w:type="dxa"/>
+              <w:right w:w="90" w:type="dxa"/>
+            </w:tcMar>
+            <w:vAlign w:val="center"/>
           </w:tcPr>
           <w:p>
             <w:pPr>
-              <w:spacing w:after="0" w:line="259" w:lineRule="auto"/>
+              <w:spacing w:line="259" w:lineRule="auto"/>
               <w:jc w:val="center"/>
             </w:pPr>
             <w:r>
@@ -19493,26 +19455,24 @@
       <w:tr>
         <w:tc>
           <w:tcPr>
-            <w:tcW w:type="dxa" w:w="3168"/>
-            <w:vAlign w:val="center"/>
-            <w:tcMar>
-              <w:top w:w="90" w:type="dxa"/>
-              <w:start w:w="90" w:type="dxa"/>
-              <w:bottom w:w="90" w:type="dxa"/>
-              <w:end w:w="90" w:type="dxa"/>
-            </w:tcMar>
+            <w:tcW w:w="3168" w:type="dxa"/>
             <w:tcBorders>
               <w:top w:val="single" w:sz="6" w:space="0" w:color="D9E2DD"/>
               <w:left w:val="single" w:sz="6" w:space="0" w:color="D9E2DD"/>
               <w:bottom w:val="single" w:sz="6" w:space="0" w:color="D9E2DD"/>
               <w:right w:val="single" w:sz="6" w:space="0" w:color="D9E2DD"/>
-              <w:insideH w:val="single" w:sz="6" w:space="0" w:color="D9E2DD"/>
-              <w:insideV w:val="single" w:sz="6" w:space="0" w:color="D9E2DD"/>
-            </w:tcBorders>
+            </w:tcBorders>
+            <w:tcMar>
+              <w:top w:w="90" w:type="dxa"/>
+              <w:left w:w="90" w:type="dxa"/>
+              <w:bottom w:w="90" w:type="dxa"/>
+              <w:right w:w="90" w:type="dxa"/>
+            </w:tcMar>
+            <w:vAlign w:val="center"/>
           </w:tcPr>
           <w:p>
             <w:pPr>
-              <w:spacing w:after="0" w:line="259" w:lineRule="auto"/>
+              <w:spacing w:line="259" w:lineRule="auto"/>
             </w:pPr>
             <w:r>
               <w:rPr>
@@ -19524,26 +19484,24 @@
         </w:tc>
         <w:tc>
           <w:tcPr>
-            <w:tcW w:type="dxa" w:w="9072"/>
-            <w:vAlign w:val="center"/>
-            <w:tcMar>
-              <w:top w:w="90" w:type="dxa"/>
-              <w:start w:w="90" w:type="dxa"/>
-              <w:bottom w:w="90" w:type="dxa"/>
-              <w:end w:w="90" w:type="dxa"/>
-            </w:tcMar>
+            <w:tcW w:w="9072" w:type="dxa"/>
             <w:tcBorders>
               <w:top w:val="single" w:sz="6" w:space="0" w:color="D9E2DD"/>
               <w:left w:val="single" w:sz="6" w:space="0" w:color="D9E2DD"/>
               <w:bottom w:val="single" w:sz="6" w:space="0" w:color="D9E2DD"/>
               <w:right w:val="single" w:sz="6" w:space="0" w:color="D9E2DD"/>
-              <w:insideH w:val="single" w:sz="6" w:space="0" w:color="D9E2DD"/>
-              <w:insideV w:val="single" w:sz="6" w:space="0" w:color="D9E2DD"/>
-            </w:tcBorders>
+            </w:tcBorders>
+            <w:tcMar>
+              <w:top w:w="90" w:type="dxa"/>
+              <w:left w:w="90" w:type="dxa"/>
+              <w:bottom w:w="90" w:type="dxa"/>
+              <w:right w:w="90" w:type="dxa"/>
+            </w:tcMar>
+            <w:vAlign w:val="center"/>
           </w:tcPr>
           <w:p>
             <w:pPr>
-              <w:spacing w:after="0" w:line="259" w:lineRule="auto"/>
+              <w:spacing w:line="259" w:lineRule="auto"/>
             </w:pPr>
             <w:r>
               <w:rPr>
@@ -19557,26 +19515,24 @@
       <w:tr>
         <w:tc>
           <w:tcPr>
-            <w:tcW w:type="dxa" w:w="3168"/>
-            <w:vAlign w:val="center"/>
-            <w:tcMar>
-              <w:top w:w="90" w:type="dxa"/>
-              <w:start w:w="90" w:type="dxa"/>
-              <w:bottom w:w="90" w:type="dxa"/>
-              <w:end w:w="90" w:type="dxa"/>
-            </w:tcMar>
+            <w:tcW w:w="3168" w:type="dxa"/>
             <w:tcBorders>
               <w:top w:val="single" w:sz="6" w:space="0" w:color="D9E2DD"/>
               <w:left w:val="single" w:sz="6" w:space="0" w:color="D9E2DD"/>
               <w:bottom w:val="single" w:sz="6" w:space="0" w:color="D9E2DD"/>
               <w:right w:val="single" w:sz="6" w:space="0" w:color="D9E2DD"/>
-              <w:insideH w:val="single" w:sz="6" w:space="0" w:color="D9E2DD"/>
-              <w:insideV w:val="single" w:sz="6" w:space="0" w:color="D9E2DD"/>
-            </w:tcBorders>
+            </w:tcBorders>
+            <w:tcMar>
+              <w:top w:w="90" w:type="dxa"/>
+              <w:left w:w="90" w:type="dxa"/>
+              <w:bottom w:w="90" w:type="dxa"/>
+              <w:right w:w="90" w:type="dxa"/>
+            </w:tcMar>
+            <w:vAlign w:val="center"/>
           </w:tcPr>
           <w:p>
             <w:pPr>
-              <w:spacing w:after="0" w:line="259" w:lineRule="auto"/>
+              <w:spacing w:line="259" w:lineRule="auto"/>
             </w:pPr>
             <w:r>
               <w:rPr>
@@ -19588,26 +19544,24 @@
         </w:tc>
         <w:tc>
           <w:tcPr>
-            <w:tcW w:type="dxa" w:w="9072"/>
-            <w:vAlign w:val="center"/>
-            <w:tcMar>
-              <w:top w:w="90" w:type="dxa"/>
-              <w:start w:w="90" w:type="dxa"/>
-              <w:bottom w:w="90" w:type="dxa"/>
-              <w:end w:w="90" w:type="dxa"/>
-            </w:tcMar>
+            <w:tcW w:w="9072" w:type="dxa"/>
             <w:tcBorders>
               <w:top w:val="single" w:sz="6" w:space="0" w:color="D9E2DD"/>
               <w:left w:val="single" w:sz="6" w:space="0" w:color="D9E2DD"/>
               <w:bottom w:val="single" w:sz="6" w:space="0" w:color="D9E2DD"/>
               <w:right w:val="single" w:sz="6" w:space="0" w:color="D9E2DD"/>
-              <w:insideH w:val="single" w:sz="6" w:space="0" w:color="D9E2DD"/>
-              <w:insideV w:val="single" w:sz="6" w:space="0" w:color="D9E2DD"/>
-            </w:tcBorders>
+            </w:tcBorders>
+            <w:tcMar>
+              <w:top w:w="90" w:type="dxa"/>
+              <w:left w:w="90" w:type="dxa"/>
+              <w:bottom w:w="90" w:type="dxa"/>
+              <w:right w:w="90" w:type="dxa"/>
+            </w:tcMar>
+            <w:vAlign w:val="center"/>
           </w:tcPr>
           <w:p>
             <w:pPr>
-              <w:spacing w:after="0" w:line="259" w:lineRule="auto"/>
+              <w:spacing w:line="259" w:lineRule="auto"/>
             </w:pPr>
             <w:r>
               <w:rPr>
@@ -19621,26 +19575,24 @@
       <w:tr>
         <w:tc>
           <w:tcPr>
-            <w:tcW w:type="dxa" w:w="3168"/>
-            <w:vAlign w:val="center"/>
-            <w:tcMar>
-              <w:top w:w="90" w:type="dxa"/>
-              <w:start w:w="90" w:type="dxa"/>
-              <w:bottom w:w="90" w:type="dxa"/>
-              <w:end w:w="90" w:type="dxa"/>
-            </w:tcMar>
+            <w:tcW w:w="3168" w:type="dxa"/>
             <w:tcBorders>
               <w:top w:val="single" w:sz="6" w:space="0" w:color="D9E2DD"/>
               <w:left w:val="single" w:sz="6" w:space="0" w:color="D9E2DD"/>
               <w:bottom w:val="single" w:sz="6" w:space="0" w:color="D9E2DD"/>
               <w:right w:val="single" w:sz="6" w:space="0" w:color="D9E2DD"/>
-              <w:insideH w:val="single" w:sz="6" w:space="0" w:color="D9E2DD"/>
-              <w:insideV w:val="single" w:sz="6" w:space="0" w:color="D9E2DD"/>
-            </w:tcBorders>
+            </w:tcBorders>
+            <w:tcMar>
+              <w:top w:w="90" w:type="dxa"/>
+              <w:left w:w="90" w:type="dxa"/>
+              <w:bottom w:w="90" w:type="dxa"/>
+              <w:right w:w="90" w:type="dxa"/>
+            </w:tcMar>
+            <w:vAlign w:val="center"/>
           </w:tcPr>
           <w:p>
             <w:pPr>
-              <w:spacing w:after="0" w:line="259" w:lineRule="auto"/>
+              <w:spacing w:line="259" w:lineRule="auto"/>
             </w:pPr>
             <w:r>
               <w:rPr>
@@ -19652,26 +19604,24 @@
         </w:tc>
         <w:tc>
           <w:tcPr>
-            <w:tcW w:type="dxa" w:w="9072"/>
-            <w:vAlign w:val="center"/>
-            <w:tcMar>
-              <w:top w:w="90" w:type="dxa"/>
-              <w:start w:w="90" w:type="dxa"/>
-              <w:bottom w:w="90" w:type="dxa"/>
-              <w:end w:w="90" w:type="dxa"/>
-            </w:tcMar>
+            <w:tcW w:w="9072" w:type="dxa"/>
             <w:tcBorders>
               <w:top w:val="single" w:sz="6" w:space="0" w:color="D9E2DD"/>
               <w:left w:val="single" w:sz="6" w:space="0" w:color="D9E2DD"/>
               <w:bottom w:val="single" w:sz="6" w:space="0" w:color="D9E2DD"/>
               <w:right w:val="single" w:sz="6" w:space="0" w:color="D9E2DD"/>
-              <w:insideH w:val="single" w:sz="6" w:space="0" w:color="D9E2DD"/>
-              <w:insideV w:val="single" w:sz="6" w:space="0" w:color="D9E2DD"/>
-            </w:tcBorders>
+            </w:tcBorders>
+            <w:tcMar>
+              <w:top w:w="90" w:type="dxa"/>
+              <w:left w:w="90" w:type="dxa"/>
+              <w:bottom w:w="90" w:type="dxa"/>
+              <w:right w:w="90" w:type="dxa"/>
+            </w:tcMar>
+            <w:vAlign w:val="center"/>
           </w:tcPr>
           <w:p>
             <w:pPr>
-              <w:spacing w:after="0" w:line="259" w:lineRule="auto"/>
+              <w:spacing w:line="259" w:lineRule="auto"/>
             </w:pPr>
             <w:r>
               <w:rPr>
@@ -19685,26 +19635,24 @@
       <w:tr>
         <w:tc>
           <w:tcPr>
-            <w:tcW w:type="dxa" w:w="3168"/>
-            <w:vAlign w:val="center"/>
-            <w:tcMar>
-              <w:top w:w="90" w:type="dxa"/>
-              <w:start w:w="90" w:type="dxa"/>
-              <w:bottom w:w="90" w:type="dxa"/>
-              <w:end w:w="90" w:type="dxa"/>
-            </w:tcMar>
+            <w:tcW w:w="3168" w:type="dxa"/>
             <w:tcBorders>
               <w:top w:val="single" w:sz="6" w:space="0" w:color="D9E2DD"/>
               <w:left w:val="single" w:sz="6" w:space="0" w:color="D9E2DD"/>
               <w:bottom w:val="single" w:sz="6" w:space="0" w:color="D9E2DD"/>
               <w:right w:val="single" w:sz="6" w:space="0" w:color="D9E2DD"/>
-              <w:insideH w:val="single" w:sz="6" w:space="0" w:color="D9E2DD"/>
-              <w:insideV w:val="single" w:sz="6" w:space="0" w:color="D9E2DD"/>
-            </w:tcBorders>
+            </w:tcBorders>
+            <w:tcMar>
+              <w:top w:w="90" w:type="dxa"/>
+              <w:left w:w="90" w:type="dxa"/>
+              <w:bottom w:w="90" w:type="dxa"/>
+              <w:right w:w="90" w:type="dxa"/>
+            </w:tcMar>
+            <w:vAlign w:val="center"/>
           </w:tcPr>
           <w:p>
             <w:pPr>
-              <w:spacing w:after="0" w:line="259" w:lineRule="auto"/>
+              <w:spacing w:line="259" w:lineRule="auto"/>
             </w:pPr>
             <w:r>
               <w:rPr>
@@ -19716,26 +19664,24 @@
         </w:tc>
         <w:tc>
           <w:tcPr>
-            <w:tcW w:type="dxa" w:w="9072"/>
-            <w:vAlign w:val="center"/>
-            <w:tcMar>
-              <w:top w:w="90" w:type="dxa"/>
-              <w:start w:w="90" w:type="dxa"/>
-              <w:bottom w:w="90" w:type="dxa"/>
-              <w:end w:w="90" w:type="dxa"/>
-            </w:tcMar>
+            <w:tcW w:w="9072" w:type="dxa"/>
             <w:tcBorders>
               <w:top w:val="single" w:sz="6" w:space="0" w:color="D9E2DD"/>
               <w:left w:val="single" w:sz="6" w:space="0" w:color="D9E2DD"/>
               <w:bottom w:val="single" w:sz="6" w:space="0" w:color="D9E2DD"/>
               <w:right w:val="single" w:sz="6" w:space="0" w:color="D9E2DD"/>
-              <w:insideH w:val="single" w:sz="6" w:space="0" w:color="D9E2DD"/>
-              <w:insideV w:val="single" w:sz="6" w:space="0" w:color="D9E2DD"/>
-            </w:tcBorders>
+            </w:tcBorders>
+            <w:tcMar>
+              <w:top w:w="90" w:type="dxa"/>
+              <w:left w:w="90" w:type="dxa"/>
+              <w:bottom w:w="90" w:type="dxa"/>
+              <w:right w:w="90" w:type="dxa"/>
+            </w:tcMar>
+            <w:vAlign w:val="center"/>
           </w:tcPr>
           <w:p>
             <w:pPr>
-              <w:spacing w:after="0" w:line="259" w:lineRule="auto"/>
+              <w:spacing w:line="259" w:lineRule="auto"/>
             </w:pPr>
             <w:r>
               <w:rPr>
@@ -19749,26 +19695,24 @@
       <w:tr>
         <w:tc>
           <w:tcPr>
-            <w:tcW w:type="dxa" w:w="3168"/>
-            <w:vAlign w:val="center"/>
-            <w:tcMar>
-              <w:top w:w="90" w:type="dxa"/>
-              <w:start w:w="90" w:type="dxa"/>
-              <w:bottom w:w="90" w:type="dxa"/>
-              <w:end w:w="90" w:type="dxa"/>
-            </w:tcMar>
+            <w:tcW w:w="3168" w:type="dxa"/>
             <w:tcBorders>
               <w:top w:val="single" w:sz="6" w:space="0" w:color="D9E2DD"/>
               <w:left w:val="single" w:sz="6" w:space="0" w:color="D9E2DD"/>
               <w:bottom w:val="single" w:sz="6" w:space="0" w:color="D9E2DD"/>
               <w:right w:val="single" w:sz="6" w:space="0" w:color="D9E2DD"/>
-              <w:insideH w:val="single" w:sz="6" w:space="0" w:color="D9E2DD"/>
-              <w:insideV w:val="single" w:sz="6" w:space="0" w:color="D9E2DD"/>
-            </w:tcBorders>
+            </w:tcBorders>
+            <w:tcMar>
+              <w:top w:w="90" w:type="dxa"/>
+              <w:left w:w="90" w:type="dxa"/>
+              <w:bottom w:w="90" w:type="dxa"/>
+              <w:right w:w="90" w:type="dxa"/>
+            </w:tcMar>
+            <w:vAlign w:val="center"/>
           </w:tcPr>
           <w:p>
             <w:pPr>
-              <w:spacing w:after="0" w:line="259" w:lineRule="auto"/>
+              <w:spacing w:line="259" w:lineRule="auto"/>
             </w:pPr>
             <w:r>
               <w:rPr>
@@ -19780,26 +19724,24 @@
         </w:tc>
         <w:tc>
           <w:tcPr>
-            <w:tcW w:type="dxa" w:w="9072"/>
-            <w:vAlign w:val="center"/>
-            <w:tcMar>
-              <w:top w:w="90" w:type="dxa"/>
-              <w:start w:w="90" w:type="dxa"/>
-              <w:bottom w:w="90" w:type="dxa"/>
-              <w:end w:w="90" w:type="dxa"/>
-            </w:tcMar>
+            <w:tcW w:w="9072" w:type="dxa"/>
             <w:tcBorders>
               <w:top w:val="single" w:sz="6" w:space="0" w:color="D9E2DD"/>
               <w:left w:val="single" w:sz="6" w:space="0" w:color="D9E2DD"/>
               <w:bottom w:val="single" w:sz="6" w:space="0" w:color="D9E2DD"/>
               <w:right w:val="single" w:sz="6" w:space="0" w:color="D9E2DD"/>
-              <w:insideH w:val="single" w:sz="6" w:space="0" w:color="D9E2DD"/>
-              <w:insideV w:val="single" w:sz="6" w:space="0" w:color="D9E2DD"/>
-            </w:tcBorders>
+            </w:tcBorders>
+            <w:tcMar>
+              <w:top w:w="90" w:type="dxa"/>
+              <w:left w:w="90" w:type="dxa"/>
+              <w:bottom w:w="90" w:type="dxa"/>
+              <w:right w:w="90" w:type="dxa"/>
+            </w:tcMar>
+            <w:vAlign w:val="center"/>
           </w:tcPr>
           <w:p>
             <w:pPr>
-              <w:spacing w:after="0" w:line="259" w:lineRule="auto"/>
+              <w:spacing w:line="259" w:lineRule="auto"/>
             </w:pPr>
             <w:r>
               <w:rPr>
@@ -19813,26 +19755,24 @@
       <w:tr>
         <w:tc>
           <w:tcPr>
-            <w:tcW w:type="dxa" w:w="3168"/>
-            <w:vAlign w:val="center"/>
-            <w:tcMar>
-              <w:top w:w="90" w:type="dxa"/>
-              <w:start w:w="90" w:type="dxa"/>
-              <w:bottom w:w="90" w:type="dxa"/>
-              <w:end w:w="90" w:type="dxa"/>
-            </w:tcMar>
+            <w:tcW w:w="3168" w:type="dxa"/>
             <w:tcBorders>
               <w:top w:val="single" w:sz="6" w:space="0" w:color="D9E2DD"/>
               <w:left w:val="single" w:sz="6" w:space="0" w:color="D9E2DD"/>
               <w:bottom w:val="single" w:sz="6" w:space="0" w:color="D9E2DD"/>
               <w:right w:val="single" w:sz="6" w:space="0" w:color="D9E2DD"/>
-              <w:insideH w:val="single" w:sz="6" w:space="0" w:color="D9E2DD"/>
-              <w:insideV w:val="single" w:sz="6" w:space="0" w:color="D9E2DD"/>
-            </w:tcBorders>
+            </w:tcBorders>
+            <w:tcMar>
+              <w:top w:w="90" w:type="dxa"/>
+              <w:left w:w="90" w:type="dxa"/>
+              <w:bottom w:w="90" w:type="dxa"/>
+              <w:right w:w="90" w:type="dxa"/>
+            </w:tcMar>
+            <w:vAlign w:val="center"/>
           </w:tcPr>
           <w:p>
             <w:pPr>
-              <w:spacing w:after="0" w:line="259" w:lineRule="auto"/>
+              <w:spacing w:line="259" w:lineRule="auto"/>
             </w:pPr>
             <w:r>
               <w:rPr>
@@ -19844,26 +19784,24 @@
         </w:tc>
         <w:tc>
           <w:tcPr>
-            <w:tcW w:type="dxa" w:w="9072"/>
-            <w:vAlign w:val="center"/>
-            <w:tcMar>
-              <w:top w:w="90" w:type="dxa"/>
-              <w:start w:w="90" w:type="dxa"/>
-              <w:bottom w:w="90" w:type="dxa"/>
-              <w:end w:w="90" w:type="dxa"/>
-            </w:tcMar>
+            <w:tcW w:w="9072" w:type="dxa"/>
             <w:tcBorders>
               <w:top w:val="single" w:sz="6" w:space="0" w:color="D9E2DD"/>
               <w:left w:val="single" w:sz="6" w:space="0" w:color="D9E2DD"/>
               <w:bottom w:val="single" w:sz="6" w:space="0" w:color="D9E2DD"/>
               <w:right w:val="single" w:sz="6" w:space="0" w:color="D9E2DD"/>
-              <w:insideH w:val="single" w:sz="6" w:space="0" w:color="D9E2DD"/>
-              <w:insideV w:val="single" w:sz="6" w:space="0" w:color="D9E2DD"/>
-            </w:tcBorders>
+            </w:tcBorders>
+            <w:tcMar>
+              <w:top w:w="90" w:type="dxa"/>
+              <w:left w:w="90" w:type="dxa"/>
+              <w:bottom w:w="90" w:type="dxa"/>
+              <w:right w:w="90" w:type="dxa"/>
+            </w:tcMar>
+            <w:vAlign w:val="center"/>
           </w:tcPr>
           <w:p>
             <w:pPr>
-              <w:spacing w:after="0" w:line="259" w:lineRule="auto"/>
+              <w:spacing w:line="259" w:lineRule="auto"/>
             </w:pPr>
             <w:r>
               <w:rPr>
@@ -19877,26 +19815,24 @@
       <w:tr>
         <w:tc>
           <w:tcPr>
-            <w:tcW w:type="dxa" w:w="3168"/>
-            <w:vAlign w:val="center"/>
-            <w:tcMar>
-              <w:top w:w="90" w:type="dxa"/>
-              <w:start w:w="90" w:type="dxa"/>
-              <w:bottom w:w="90" w:type="dxa"/>
-              <w:end w:w="90" w:type="dxa"/>
-            </w:tcMar>
+            <w:tcW w:w="3168" w:type="dxa"/>
             <w:tcBorders>
               <w:top w:val="single" w:sz="6" w:space="0" w:color="D9E2DD"/>
               <w:left w:val="single" w:sz="6" w:space="0" w:color="D9E2DD"/>
               <w:bottom w:val="single" w:sz="6" w:space="0" w:color="D9E2DD"/>
               <w:right w:val="single" w:sz="6" w:space="0" w:color="D9E2DD"/>
-              <w:insideH w:val="single" w:sz="6" w:space="0" w:color="D9E2DD"/>
-              <w:insideV w:val="single" w:sz="6" w:space="0" w:color="D9E2DD"/>
-            </w:tcBorders>
+            </w:tcBorders>
+            <w:tcMar>
+              <w:top w:w="90" w:type="dxa"/>
+              <w:left w:w="90" w:type="dxa"/>
+              <w:bottom w:w="90" w:type="dxa"/>
+              <w:right w:w="90" w:type="dxa"/>
+            </w:tcMar>
+            <w:vAlign w:val="center"/>
           </w:tcPr>
           <w:p>
             <w:pPr>
-              <w:spacing w:after="0" w:line="259" w:lineRule="auto"/>
+              <w:spacing w:line="259" w:lineRule="auto"/>
             </w:pPr>
             <w:r>
               <w:rPr>
@@ -19908,26 +19844,24 @@
         </w:tc>
         <w:tc>
           <w:tcPr>
-            <w:tcW w:type="dxa" w:w="9072"/>
-            <w:vAlign w:val="center"/>
-            <w:tcMar>
-              <w:top w:w="90" w:type="dxa"/>
-              <w:start w:w="90" w:type="dxa"/>
-              <w:bottom w:w="90" w:type="dxa"/>
-              <w:end w:w="90" w:type="dxa"/>
-            </w:tcMar>
+            <w:tcW w:w="9072" w:type="dxa"/>
             <w:tcBorders>
               <w:top w:val="single" w:sz="6" w:space="0" w:color="D9E2DD"/>
               <w:left w:val="single" w:sz="6" w:space="0" w:color="D9E2DD"/>
               <w:bottom w:val="single" w:sz="6" w:space="0" w:color="D9E2DD"/>
               <w:right w:val="single" w:sz="6" w:space="0" w:color="D9E2DD"/>
-              <w:insideH w:val="single" w:sz="6" w:space="0" w:color="D9E2DD"/>
-              <w:insideV w:val="single" w:sz="6" w:space="0" w:color="D9E2DD"/>
-            </w:tcBorders>
+            </w:tcBorders>
+            <w:tcMar>
+              <w:top w:w="90" w:type="dxa"/>
+              <w:left w:w="90" w:type="dxa"/>
+              <w:bottom w:w="90" w:type="dxa"/>
+              <w:right w:w="90" w:type="dxa"/>
+            </w:tcMar>
+            <w:vAlign w:val="center"/>
           </w:tcPr>
           <w:p>
             <w:pPr>
-              <w:spacing w:after="0" w:line="259" w:lineRule="auto"/>
+              <w:spacing w:line="259" w:lineRule="auto"/>
             </w:pPr>
             <w:r>
               <w:rPr>
@@ -19951,40 +19885,38 @@
     </w:p>
     <w:tbl>
       <w:tblPr>
-        <w:tblW w:type="auto" w:w="0"/>
+        <w:tblW w:w="0" w:type="auto"/>
         <w:tblLayout w:type="fixed"/>
-        <w:tblLook w:firstColumn="1" w:firstRow="1" w:lastColumn="0" w:lastRow="0" w:noHBand="0" w:noVBand="1" w:val="04A0"/>
+        <w:tblLook w:val="04A0" w:firstRow="1" w:lastRow="0" w:firstColumn="1" w:lastColumn="0" w:noHBand="0" w:noVBand="1"/>
       </w:tblPr>
       <w:tblGrid>
-        <w:gridCol w:w="2340"/>
-        <w:gridCol w:w="2340"/>
-        <w:gridCol w:w="2340"/>
-        <w:gridCol w:w="2340"/>
+        <w:gridCol w:w="1080"/>
+        <w:gridCol w:w="2592"/>
+        <w:gridCol w:w="4392"/>
+        <w:gridCol w:w="4176"/>
       </w:tblGrid>
       <w:tr>
         <w:tc>
           <w:tcPr>
-            <w:tcW w:type="dxa" w:w="1080"/>
-            <w:vAlign w:val="center"/>
-            <w:tcMar>
-              <w:top w:w="90" w:type="dxa"/>
-              <w:start w:w="90" w:type="dxa"/>
-              <w:bottom w:w="90" w:type="dxa"/>
-              <w:end w:w="90" w:type="dxa"/>
-            </w:tcMar>
+            <w:tcW w:w="1080" w:type="dxa"/>
             <w:tcBorders>
               <w:top w:val="single" w:sz="6" w:space="0" w:color="D9E2DD"/>
               <w:left w:val="single" w:sz="6" w:space="0" w:color="D9E2DD"/>
               <w:bottom w:val="single" w:sz="6" w:space="0" w:color="D9E2DD"/>
               <w:right w:val="single" w:sz="6" w:space="0" w:color="D9E2DD"/>
-              <w:insideH w:val="single" w:sz="6" w:space="0" w:color="D9E2DD"/>
-              <w:insideV w:val="single" w:sz="6" w:space="0" w:color="D9E2DD"/>
-            </w:tcBorders>
-            <w:shd w:fill="1A5C38"/>
+            </w:tcBorders>
+            <w:shd w:val="clear" w:color="auto" w:fill="1A5C38"/>
+            <w:tcMar>
+              <w:top w:w="90" w:type="dxa"/>
+              <w:left w:w="90" w:type="dxa"/>
+              <w:bottom w:w="90" w:type="dxa"/>
+              <w:right w:w="90" w:type="dxa"/>
+            </w:tcMar>
+            <w:vAlign w:val="center"/>
           </w:tcPr>
           <w:p>
             <w:pPr>
-              <w:spacing w:after="0" w:line="259" w:lineRule="auto"/>
+              <w:spacing w:line="259" w:lineRule="auto"/>
               <w:jc w:val="center"/>
             </w:pPr>
             <w:r>
@@ -19999,27 +19931,25 @@
         </w:tc>
         <w:tc>
           <w:tcPr>
-            <w:tcW w:type="dxa" w:w="2592"/>
-            <w:vAlign w:val="center"/>
-            <w:tcMar>
-              <w:top w:w="90" w:type="dxa"/>
-              <w:start w:w="90" w:type="dxa"/>
-              <w:bottom w:w="90" w:type="dxa"/>
-              <w:end w:w="90" w:type="dxa"/>
-            </w:tcMar>
+            <w:tcW w:w="2592" w:type="dxa"/>
             <w:tcBorders>
               <w:top w:val="single" w:sz="6" w:space="0" w:color="D9E2DD"/>
               <w:left w:val="single" w:sz="6" w:space="0" w:color="D9E2DD"/>
               <w:bottom w:val="single" w:sz="6" w:space="0" w:color="D9E2DD"/>
               <w:right w:val="single" w:sz="6" w:space="0" w:color="D9E2DD"/>
-              <w:insideH w:val="single" w:sz="6" w:space="0" w:color="D9E2DD"/>
-              <w:insideV w:val="single" w:sz="6" w:space="0" w:color="D9E2DD"/>
-            </w:tcBorders>
-            <w:shd w:fill="1A5C38"/>
+            </w:tcBorders>
+            <w:shd w:val="clear" w:color="auto" w:fill="1A5C38"/>
+            <w:tcMar>
+              <w:top w:w="90" w:type="dxa"/>
+              <w:left w:w="90" w:type="dxa"/>
+              <w:bottom w:w="90" w:type="dxa"/>
+              <w:right w:w="90" w:type="dxa"/>
+            </w:tcMar>
+            <w:vAlign w:val="center"/>
           </w:tcPr>
           <w:p>
             <w:pPr>
-              <w:spacing w:after="0" w:line="259" w:lineRule="auto"/>
+              <w:spacing w:line="259" w:lineRule="auto"/>
               <w:jc w:val="center"/>
             </w:pPr>
             <w:r>
@@ -20034,27 +19964,25 @@
         </w:tc>
         <w:tc>
           <w:tcPr>
-            <w:tcW w:type="dxa" w:w="4392"/>
-            <w:vAlign w:val="center"/>
-            <w:tcMar>
-              <w:top w:w="90" w:type="dxa"/>
-              <w:start w:w="90" w:type="dxa"/>
-              <w:bottom w:w="90" w:type="dxa"/>
-              <w:end w:w="90" w:type="dxa"/>
-            </w:tcMar>
+            <w:tcW w:w="4392" w:type="dxa"/>
             <w:tcBorders>
               <w:top w:val="single" w:sz="6" w:space="0" w:color="D9E2DD"/>
               <w:left w:val="single" w:sz="6" w:space="0" w:color="D9E2DD"/>
               <w:bottom w:val="single" w:sz="6" w:space="0" w:color="D9E2DD"/>
               <w:right w:val="single" w:sz="6" w:space="0" w:color="D9E2DD"/>
-              <w:insideH w:val="single" w:sz="6" w:space="0" w:color="D9E2DD"/>
-              <w:insideV w:val="single" w:sz="6" w:space="0" w:color="D9E2DD"/>
-            </w:tcBorders>
-            <w:shd w:fill="1A5C38"/>
+            </w:tcBorders>
+            <w:shd w:val="clear" w:color="auto" w:fill="1A5C38"/>
+            <w:tcMar>
+              <w:top w:w="90" w:type="dxa"/>
+              <w:left w:w="90" w:type="dxa"/>
+              <w:bottom w:w="90" w:type="dxa"/>
+              <w:right w:w="90" w:type="dxa"/>
+            </w:tcMar>
+            <w:vAlign w:val="center"/>
           </w:tcPr>
           <w:p>
             <w:pPr>
-              <w:spacing w:after="0" w:line="259" w:lineRule="auto"/>
+              <w:spacing w:line="259" w:lineRule="auto"/>
               <w:jc w:val="center"/>
             </w:pPr>
             <w:r>
@@ -20069,27 +19997,25 @@
         </w:tc>
         <w:tc>
           <w:tcPr>
-            <w:tcW w:type="dxa" w:w="4176"/>
-            <w:vAlign w:val="center"/>
-            <w:tcMar>
-              <w:top w:w="90" w:type="dxa"/>
-              <w:start w:w="90" w:type="dxa"/>
-              <w:bottom w:w="90" w:type="dxa"/>
-              <w:end w:w="90" w:type="dxa"/>
-            </w:tcMar>
+            <w:tcW w:w="4176" w:type="dxa"/>
             <w:tcBorders>
               <w:top w:val="single" w:sz="6" w:space="0" w:color="D9E2DD"/>
               <w:left w:val="single" w:sz="6" w:space="0" w:color="D9E2DD"/>
               <w:bottom w:val="single" w:sz="6" w:space="0" w:color="D9E2DD"/>
               <w:right w:val="single" w:sz="6" w:space="0" w:color="D9E2DD"/>
-              <w:insideH w:val="single" w:sz="6" w:space="0" w:color="D9E2DD"/>
-              <w:insideV w:val="single" w:sz="6" w:space="0" w:color="D9E2DD"/>
-            </w:tcBorders>
-            <w:shd w:fill="1A5C38"/>
+            </w:tcBorders>
+            <w:shd w:val="clear" w:color="auto" w:fill="1A5C38"/>
+            <w:tcMar>
+              <w:top w:w="90" w:type="dxa"/>
+              <w:left w:w="90" w:type="dxa"/>
+              <w:bottom w:w="90" w:type="dxa"/>
+              <w:right w:w="90" w:type="dxa"/>
+            </w:tcMar>
+            <w:vAlign w:val="center"/>
           </w:tcPr>
           <w:p>
             <w:pPr>
-              <w:spacing w:after="0" w:line="259" w:lineRule="auto"/>
+              <w:spacing w:line="259" w:lineRule="auto"/>
               <w:jc w:val="center"/>
             </w:pPr>
             <w:r>
@@ -20106,26 +20032,24 @@
       <w:tr>
         <w:tc>
           <w:tcPr>
-            <w:tcW w:type="dxa" w:w="1080"/>
-            <w:vAlign w:val="center"/>
-            <w:tcMar>
-              <w:top w:w="90" w:type="dxa"/>
-              <w:start w:w="90" w:type="dxa"/>
-              <w:bottom w:w="90" w:type="dxa"/>
-              <w:end w:w="90" w:type="dxa"/>
-            </w:tcMar>
+            <w:tcW w:w="1080" w:type="dxa"/>
             <w:tcBorders>
               <w:top w:val="single" w:sz="6" w:space="0" w:color="D9E2DD"/>
               <w:left w:val="single" w:sz="6" w:space="0" w:color="D9E2DD"/>
               <w:bottom w:val="single" w:sz="6" w:space="0" w:color="D9E2DD"/>
               <w:right w:val="single" w:sz="6" w:space="0" w:color="D9E2DD"/>
-              <w:insideH w:val="single" w:sz="6" w:space="0" w:color="D9E2DD"/>
-              <w:insideV w:val="single" w:sz="6" w:space="0" w:color="D9E2DD"/>
-            </w:tcBorders>
+            </w:tcBorders>
+            <w:tcMar>
+              <w:top w:w="90" w:type="dxa"/>
+              <w:left w:w="90" w:type="dxa"/>
+              <w:bottom w:w="90" w:type="dxa"/>
+              <w:right w:w="90" w:type="dxa"/>
+            </w:tcMar>
+            <w:vAlign w:val="center"/>
           </w:tcPr>
           <w:p>
             <w:pPr>
-              <w:spacing w:after="0" w:line="259" w:lineRule="auto"/>
+              <w:spacing w:line="259" w:lineRule="auto"/>
             </w:pPr>
             <w:r>
               <w:rPr>
@@ -20137,26 +20061,24 @@
         </w:tc>
         <w:tc>
           <w:tcPr>
-            <w:tcW w:type="dxa" w:w="2592"/>
-            <w:vAlign w:val="center"/>
-            <w:tcMar>
-              <w:top w:w="90" w:type="dxa"/>
-              <w:start w:w="90" w:type="dxa"/>
-              <w:bottom w:w="90" w:type="dxa"/>
-              <w:end w:w="90" w:type="dxa"/>
-            </w:tcMar>
+            <w:tcW w:w="2592" w:type="dxa"/>
             <w:tcBorders>
               <w:top w:val="single" w:sz="6" w:space="0" w:color="D9E2DD"/>
               <w:left w:val="single" w:sz="6" w:space="0" w:color="D9E2DD"/>
               <w:bottom w:val="single" w:sz="6" w:space="0" w:color="D9E2DD"/>
               <w:right w:val="single" w:sz="6" w:space="0" w:color="D9E2DD"/>
-              <w:insideH w:val="single" w:sz="6" w:space="0" w:color="D9E2DD"/>
-              <w:insideV w:val="single" w:sz="6" w:space="0" w:color="D9E2DD"/>
-            </w:tcBorders>
+            </w:tcBorders>
+            <w:tcMar>
+              <w:top w:w="90" w:type="dxa"/>
+              <w:left w:w="90" w:type="dxa"/>
+              <w:bottom w:w="90" w:type="dxa"/>
+              <w:right w:w="90" w:type="dxa"/>
+            </w:tcMar>
+            <w:vAlign w:val="center"/>
           </w:tcPr>
           <w:p>
             <w:pPr>
-              <w:spacing w:after="0" w:line="259" w:lineRule="auto"/>
+              <w:spacing w:line="259" w:lineRule="auto"/>
             </w:pPr>
             <w:r>
               <w:rPr>
@@ -20168,26 +20090,24 @@
         </w:tc>
         <w:tc>
           <w:tcPr>
-            <w:tcW w:type="dxa" w:w="4392"/>
-            <w:vAlign w:val="center"/>
-            <w:tcMar>
-              <w:top w:w="90" w:type="dxa"/>
-              <w:start w:w="90" w:type="dxa"/>
-              <w:bottom w:w="90" w:type="dxa"/>
-              <w:end w:w="90" w:type="dxa"/>
-            </w:tcMar>
+            <w:tcW w:w="4392" w:type="dxa"/>
             <w:tcBorders>
               <w:top w:val="single" w:sz="6" w:space="0" w:color="D9E2DD"/>
               <w:left w:val="single" w:sz="6" w:space="0" w:color="D9E2DD"/>
               <w:bottom w:val="single" w:sz="6" w:space="0" w:color="D9E2DD"/>
               <w:right w:val="single" w:sz="6" w:space="0" w:color="D9E2DD"/>
-              <w:insideH w:val="single" w:sz="6" w:space="0" w:color="D9E2DD"/>
-              <w:insideV w:val="single" w:sz="6" w:space="0" w:color="D9E2DD"/>
-            </w:tcBorders>
+            </w:tcBorders>
+            <w:tcMar>
+              <w:top w:w="90" w:type="dxa"/>
+              <w:left w:w="90" w:type="dxa"/>
+              <w:bottom w:w="90" w:type="dxa"/>
+              <w:right w:w="90" w:type="dxa"/>
+            </w:tcMar>
+            <w:vAlign w:val="center"/>
           </w:tcPr>
           <w:p>
             <w:pPr>
-              <w:spacing w:after="0" w:line="259" w:lineRule="auto"/>
+              <w:spacing w:line="259" w:lineRule="auto"/>
             </w:pPr>
             <w:r>
               <w:rPr>
@@ -20199,26 +20119,24 @@
         </w:tc>
         <w:tc>
           <w:tcPr>
-            <w:tcW w:type="dxa" w:w="4176"/>
-            <w:vAlign w:val="center"/>
-            <w:tcMar>
-              <w:top w:w="90" w:type="dxa"/>
-              <w:start w:w="90" w:type="dxa"/>
-              <w:bottom w:w="90" w:type="dxa"/>
-              <w:end w:w="90" w:type="dxa"/>
-            </w:tcMar>
+            <w:tcW w:w="4176" w:type="dxa"/>
             <w:tcBorders>
               <w:top w:val="single" w:sz="6" w:space="0" w:color="D9E2DD"/>
               <w:left w:val="single" w:sz="6" w:space="0" w:color="D9E2DD"/>
               <w:bottom w:val="single" w:sz="6" w:space="0" w:color="D9E2DD"/>
               <w:right w:val="single" w:sz="6" w:space="0" w:color="D9E2DD"/>
-              <w:insideH w:val="single" w:sz="6" w:space="0" w:color="D9E2DD"/>
-              <w:insideV w:val="single" w:sz="6" w:space="0" w:color="D9E2DD"/>
-            </w:tcBorders>
+            </w:tcBorders>
+            <w:tcMar>
+              <w:top w:w="90" w:type="dxa"/>
+              <w:left w:w="90" w:type="dxa"/>
+              <w:bottom w:w="90" w:type="dxa"/>
+              <w:right w:w="90" w:type="dxa"/>
+            </w:tcMar>
+            <w:vAlign w:val="center"/>
           </w:tcPr>
           <w:p>
             <w:pPr>
-              <w:spacing w:after="0" w:line="259" w:lineRule="auto"/>
+              <w:spacing w:line="259" w:lineRule="auto"/>
             </w:pPr>
             <w:r>
               <w:rPr>
@@ -20232,26 +20150,24 @@
       <w:tr>
         <w:tc>
           <w:tcPr>
-            <w:tcW w:type="dxa" w:w="1080"/>
-            <w:vAlign w:val="center"/>
-            <w:tcMar>
-              <w:top w:w="90" w:type="dxa"/>
-              <w:start w:w="90" w:type="dxa"/>
-              <w:bottom w:w="90" w:type="dxa"/>
-              <w:end w:w="90" w:type="dxa"/>
-            </w:tcMar>
+            <w:tcW w:w="1080" w:type="dxa"/>
             <w:tcBorders>
               <w:top w:val="single" w:sz="6" w:space="0" w:color="D9E2DD"/>
               <w:left w:val="single" w:sz="6" w:space="0" w:color="D9E2DD"/>
               <w:bottom w:val="single" w:sz="6" w:space="0" w:color="D9E2DD"/>
               <w:right w:val="single" w:sz="6" w:space="0" w:color="D9E2DD"/>
-              <w:insideH w:val="single" w:sz="6" w:space="0" w:color="D9E2DD"/>
-              <w:insideV w:val="single" w:sz="6" w:space="0" w:color="D9E2DD"/>
-            </w:tcBorders>
+            </w:tcBorders>
+            <w:tcMar>
+              <w:top w:w="90" w:type="dxa"/>
+              <w:left w:w="90" w:type="dxa"/>
+              <w:bottom w:w="90" w:type="dxa"/>
+              <w:right w:w="90" w:type="dxa"/>
+            </w:tcMar>
+            <w:vAlign w:val="center"/>
           </w:tcPr>
           <w:p>
             <w:pPr>
-              <w:spacing w:after="0" w:line="259" w:lineRule="auto"/>
+              <w:spacing w:line="259" w:lineRule="auto"/>
             </w:pPr>
             <w:r>
               <w:rPr>
@@ -20263,26 +20179,24 @@
         </w:tc>
         <w:tc>
           <w:tcPr>
-            <w:tcW w:type="dxa" w:w="2592"/>
-            <w:vAlign w:val="center"/>
-            <w:tcMar>
-              <w:top w:w="90" w:type="dxa"/>
-              <w:start w:w="90" w:type="dxa"/>
-              <w:bottom w:w="90" w:type="dxa"/>
-              <w:end w:w="90" w:type="dxa"/>
-            </w:tcMar>
+            <w:tcW w:w="2592" w:type="dxa"/>
             <w:tcBorders>
               <w:top w:val="single" w:sz="6" w:space="0" w:color="D9E2DD"/>
               <w:left w:val="single" w:sz="6" w:space="0" w:color="D9E2DD"/>
               <w:bottom w:val="single" w:sz="6" w:space="0" w:color="D9E2DD"/>
               <w:right w:val="single" w:sz="6" w:space="0" w:color="D9E2DD"/>
-              <w:insideH w:val="single" w:sz="6" w:space="0" w:color="D9E2DD"/>
-              <w:insideV w:val="single" w:sz="6" w:space="0" w:color="D9E2DD"/>
-            </w:tcBorders>
+            </w:tcBorders>
+            <w:tcMar>
+              <w:top w:w="90" w:type="dxa"/>
+              <w:left w:w="90" w:type="dxa"/>
+              <w:bottom w:w="90" w:type="dxa"/>
+              <w:right w:w="90" w:type="dxa"/>
+            </w:tcMar>
+            <w:vAlign w:val="center"/>
           </w:tcPr>
           <w:p>
             <w:pPr>
-              <w:spacing w:after="0" w:line="259" w:lineRule="auto"/>
+              <w:spacing w:line="259" w:lineRule="auto"/>
             </w:pPr>
             <w:r>
               <w:rPr>
@@ -20294,26 +20208,24 @@
         </w:tc>
         <w:tc>
           <w:tcPr>
-            <w:tcW w:type="dxa" w:w="4392"/>
-            <w:vAlign w:val="center"/>
-            <w:tcMar>
-              <w:top w:w="90" w:type="dxa"/>
-              <w:start w:w="90" w:type="dxa"/>
-              <w:bottom w:w="90" w:type="dxa"/>
-              <w:end w:w="90" w:type="dxa"/>
-            </w:tcMar>
+            <w:tcW w:w="4392" w:type="dxa"/>
             <w:tcBorders>
               <w:top w:val="single" w:sz="6" w:space="0" w:color="D9E2DD"/>
               <w:left w:val="single" w:sz="6" w:space="0" w:color="D9E2DD"/>
               <w:bottom w:val="single" w:sz="6" w:space="0" w:color="D9E2DD"/>
               <w:right w:val="single" w:sz="6" w:space="0" w:color="D9E2DD"/>
-              <w:insideH w:val="single" w:sz="6" w:space="0" w:color="D9E2DD"/>
-              <w:insideV w:val="single" w:sz="6" w:space="0" w:color="D9E2DD"/>
-            </w:tcBorders>
+            </w:tcBorders>
+            <w:tcMar>
+              <w:top w:w="90" w:type="dxa"/>
+              <w:left w:w="90" w:type="dxa"/>
+              <w:bottom w:w="90" w:type="dxa"/>
+              <w:right w:w="90" w:type="dxa"/>
+            </w:tcMar>
+            <w:vAlign w:val="center"/>
           </w:tcPr>
           <w:p>
             <w:pPr>
-              <w:spacing w:after="0" w:line="259" w:lineRule="auto"/>
+              <w:spacing w:line="259" w:lineRule="auto"/>
             </w:pPr>
             <w:r>
               <w:rPr>
@@ -20325,26 +20237,24 @@
         </w:tc>
         <w:tc>
           <w:tcPr>
-            <w:tcW w:type="dxa" w:w="4176"/>
-            <w:vAlign w:val="center"/>
-            <w:tcMar>
-              <w:top w:w="90" w:type="dxa"/>
-              <w:start w:w="90" w:type="dxa"/>
-              <w:bottom w:w="90" w:type="dxa"/>
-              <w:end w:w="90" w:type="dxa"/>
-            </w:tcMar>
+            <w:tcW w:w="4176" w:type="dxa"/>
             <w:tcBorders>
               <w:top w:val="single" w:sz="6" w:space="0" w:color="D9E2DD"/>
               <w:left w:val="single" w:sz="6" w:space="0" w:color="D9E2DD"/>
               <w:bottom w:val="single" w:sz="6" w:space="0" w:color="D9E2DD"/>
               <w:right w:val="single" w:sz="6" w:space="0" w:color="D9E2DD"/>
-              <w:insideH w:val="single" w:sz="6" w:space="0" w:color="D9E2DD"/>
-              <w:insideV w:val="single" w:sz="6" w:space="0" w:color="D9E2DD"/>
-            </w:tcBorders>
+            </w:tcBorders>
+            <w:tcMar>
+              <w:top w:w="90" w:type="dxa"/>
+              <w:left w:w="90" w:type="dxa"/>
+              <w:bottom w:w="90" w:type="dxa"/>
+              <w:right w:w="90" w:type="dxa"/>
+            </w:tcMar>
+            <w:vAlign w:val="center"/>
           </w:tcPr>
           <w:p>
             <w:pPr>
-              <w:spacing w:after="0" w:line="259" w:lineRule="auto"/>
+              <w:spacing w:line="259" w:lineRule="auto"/>
             </w:pPr>
             <w:r>
               <w:rPr>
@@ -20358,26 +20268,24 @@
       <w:tr>
         <w:tc>
           <w:tcPr>
-            <w:tcW w:type="dxa" w:w="1080"/>
-            <w:vAlign w:val="center"/>
-            <w:tcMar>
-              <w:top w:w="90" w:type="dxa"/>
-              <w:start w:w="90" w:type="dxa"/>
-              <w:bottom w:w="90" w:type="dxa"/>
-              <w:end w:w="90" w:type="dxa"/>
-            </w:tcMar>
+            <w:tcW w:w="1080" w:type="dxa"/>
             <w:tcBorders>
               <w:top w:val="single" w:sz="6" w:space="0" w:color="D9E2DD"/>
               <w:left w:val="single" w:sz="6" w:space="0" w:color="D9E2DD"/>
               <w:bottom w:val="single" w:sz="6" w:space="0" w:color="D9E2DD"/>
               <w:right w:val="single" w:sz="6" w:space="0" w:color="D9E2DD"/>
-              <w:insideH w:val="single" w:sz="6" w:space="0" w:color="D9E2DD"/>
-              <w:insideV w:val="single" w:sz="6" w:space="0" w:color="D9E2DD"/>
-            </w:tcBorders>
+            </w:tcBorders>
+            <w:tcMar>
+              <w:top w:w="90" w:type="dxa"/>
+              <w:left w:w="90" w:type="dxa"/>
+              <w:bottom w:w="90" w:type="dxa"/>
+              <w:right w:w="90" w:type="dxa"/>
+            </w:tcMar>
+            <w:vAlign w:val="center"/>
           </w:tcPr>
           <w:p>
             <w:pPr>
-              <w:spacing w:after="0" w:line="259" w:lineRule="auto"/>
+              <w:spacing w:line="259" w:lineRule="auto"/>
             </w:pPr>
             <w:r>
               <w:rPr>
@@ -20389,26 +20297,24 @@
         </w:tc>
         <w:tc>
           <w:tcPr>
-            <w:tcW w:type="dxa" w:w="2592"/>
-            <w:vAlign w:val="center"/>
-            <w:tcMar>
-              <w:top w:w="90" w:type="dxa"/>
-              <w:start w:w="90" w:type="dxa"/>
-              <w:bottom w:w="90" w:type="dxa"/>
-              <w:end w:w="90" w:type="dxa"/>
-            </w:tcMar>
+            <w:tcW w:w="2592" w:type="dxa"/>
             <w:tcBorders>
               <w:top w:val="single" w:sz="6" w:space="0" w:color="D9E2DD"/>
               <w:left w:val="single" w:sz="6" w:space="0" w:color="D9E2DD"/>
               <w:bottom w:val="single" w:sz="6" w:space="0" w:color="D9E2DD"/>
               <w:right w:val="single" w:sz="6" w:space="0" w:color="D9E2DD"/>
-              <w:insideH w:val="single" w:sz="6" w:space="0" w:color="D9E2DD"/>
-              <w:insideV w:val="single" w:sz="6" w:space="0" w:color="D9E2DD"/>
-            </w:tcBorders>
+            </w:tcBorders>
+            <w:tcMar>
+              <w:top w:w="90" w:type="dxa"/>
+              <w:left w:w="90" w:type="dxa"/>
+              <w:bottom w:w="90" w:type="dxa"/>
+              <w:right w:w="90" w:type="dxa"/>
+            </w:tcMar>
+            <w:vAlign w:val="center"/>
           </w:tcPr>
           <w:p>
             <w:pPr>
-              <w:spacing w:after="0" w:line="259" w:lineRule="auto"/>
+              <w:spacing w:line="259" w:lineRule="auto"/>
             </w:pPr>
             <w:r>
               <w:rPr>
@@ -20420,26 +20326,24 @@
         </w:tc>
         <w:tc>
           <w:tcPr>
-            <w:tcW w:type="dxa" w:w="4392"/>
-            <w:vAlign w:val="center"/>
-            <w:tcMar>
-              <w:top w:w="90" w:type="dxa"/>
-              <w:start w:w="90" w:type="dxa"/>
-              <w:bottom w:w="90" w:type="dxa"/>
-              <w:end w:w="90" w:type="dxa"/>
-            </w:tcMar>
+            <w:tcW w:w="4392" w:type="dxa"/>
             <w:tcBorders>
               <w:top w:val="single" w:sz="6" w:space="0" w:color="D9E2DD"/>
               <w:left w:val="single" w:sz="6" w:space="0" w:color="D9E2DD"/>
               <w:bottom w:val="single" w:sz="6" w:space="0" w:color="D9E2DD"/>
               <w:right w:val="single" w:sz="6" w:space="0" w:color="D9E2DD"/>
-              <w:insideH w:val="single" w:sz="6" w:space="0" w:color="D9E2DD"/>
-              <w:insideV w:val="single" w:sz="6" w:space="0" w:color="D9E2DD"/>
-            </w:tcBorders>
+            </w:tcBorders>
+            <w:tcMar>
+              <w:top w:w="90" w:type="dxa"/>
+              <w:left w:w="90" w:type="dxa"/>
+              <w:bottom w:w="90" w:type="dxa"/>
+              <w:right w:w="90" w:type="dxa"/>
+            </w:tcMar>
+            <w:vAlign w:val="center"/>
           </w:tcPr>
           <w:p>
             <w:pPr>
-              <w:spacing w:after="0" w:line="259" w:lineRule="auto"/>
+              <w:spacing w:line="259" w:lineRule="auto"/>
             </w:pPr>
             <w:r>
               <w:rPr>
@@ -20451,26 +20355,24 @@
         </w:tc>
         <w:tc>
           <w:tcPr>
-            <w:tcW w:type="dxa" w:w="4176"/>
-            <w:vAlign w:val="center"/>
-            <w:tcMar>
-              <w:top w:w="90" w:type="dxa"/>
-              <w:start w:w="90" w:type="dxa"/>
-              <w:bottom w:w="90" w:type="dxa"/>
-              <w:end w:w="90" w:type="dxa"/>
-            </w:tcMar>
+            <w:tcW w:w="4176" w:type="dxa"/>
             <w:tcBorders>
               <w:top w:val="single" w:sz="6" w:space="0" w:color="D9E2DD"/>
               <w:left w:val="single" w:sz="6" w:space="0" w:color="D9E2DD"/>
               <w:bottom w:val="single" w:sz="6" w:space="0" w:color="D9E2DD"/>
               <w:right w:val="single" w:sz="6" w:space="0" w:color="D9E2DD"/>
-              <w:insideH w:val="single" w:sz="6" w:space="0" w:color="D9E2DD"/>
-              <w:insideV w:val="single" w:sz="6" w:space="0" w:color="D9E2DD"/>
-            </w:tcBorders>
+            </w:tcBorders>
+            <w:tcMar>
+              <w:top w:w="90" w:type="dxa"/>
+              <w:left w:w="90" w:type="dxa"/>
+              <w:bottom w:w="90" w:type="dxa"/>
+              <w:right w:w="90" w:type="dxa"/>
+            </w:tcMar>
+            <w:vAlign w:val="center"/>
           </w:tcPr>
           <w:p>
             <w:pPr>
-              <w:spacing w:after="0" w:line="259" w:lineRule="auto"/>
+              <w:spacing w:line="259" w:lineRule="auto"/>
             </w:pPr>
             <w:r>
               <w:rPr>
@@ -20495,39 +20397,37 @@
     </w:p>
     <w:tbl>
       <w:tblPr>
-        <w:tblW w:type="auto" w:w="0"/>
+        <w:tblW w:w="0" w:type="auto"/>
         <w:tblLayout w:type="fixed"/>
-        <w:tblLook w:firstColumn="1" w:firstRow="1" w:lastColumn="0" w:lastRow="0" w:noHBand="0" w:noVBand="1" w:val="04A0"/>
+        <w:tblLook w:val="04A0" w:firstRow="1" w:lastRow="0" w:firstColumn="1" w:lastColumn="0" w:noHBand="0" w:noVBand="1"/>
       </w:tblPr>
       <w:tblGrid>
-        <w:gridCol w:w="3120"/>
-        <w:gridCol w:w="3120"/>
-        <w:gridCol w:w="3120"/>
+        <w:gridCol w:w="2880"/>
+        <w:gridCol w:w="4320"/>
+        <w:gridCol w:w="5040"/>
       </w:tblGrid>
       <w:tr>
         <w:tc>
           <w:tcPr>
-            <w:tcW w:type="dxa" w:w="2880"/>
-            <w:vAlign w:val="center"/>
-            <w:tcMar>
-              <w:top w:w="90" w:type="dxa"/>
-              <w:start w:w="90" w:type="dxa"/>
-              <w:bottom w:w="90" w:type="dxa"/>
-              <w:end w:w="90" w:type="dxa"/>
-            </w:tcMar>
+            <w:tcW w:w="2880" w:type="dxa"/>
             <w:tcBorders>
               <w:top w:val="single" w:sz="6" w:space="0" w:color="D9E2DD"/>
               <w:left w:val="single" w:sz="6" w:space="0" w:color="D9E2DD"/>
               <w:bottom w:val="single" w:sz="6" w:space="0" w:color="D9E2DD"/>
               <w:right w:val="single" w:sz="6" w:space="0" w:color="D9E2DD"/>
-              <w:insideH w:val="single" w:sz="6" w:space="0" w:color="D9E2DD"/>
-              <w:insideV w:val="single" w:sz="6" w:space="0" w:color="D9E2DD"/>
-            </w:tcBorders>
-            <w:shd w:fill="1A5C38"/>
+            </w:tcBorders>
+            <w:shd w:val="clear" w:color="auto" w:fill="1A5C38"/>
+            <w:tcMar>
+              <w:top w:w="90" w:type="dxa"/>
+              <w:left w:w="90" w:type="dxa"/>
+              <w:bottom w:w="90" w:type="dxa"/>
+              <w:right w:w="90" w:type="dxa"/>
+            </w:tcMar>
+            <w:vAlign w:val="center"/>
           </w:tcPr>
           <w:p>
             <w:pPr>
-              <w:spacing w:after="0" w:line="259" w:lineRule="auto"/>
+              <w:spacing w:line="259" w:lineRule="auto"/>
               <w:jc w:val="center"/>
             </w:pPr>
             <w:r>
@@ -20542,27 +20442,25 @@
         </w:tc>
         <w:tc>
           <w:tcPr>
-            <w:tcW w:type="dxa" w:w="4320"/>
-            <w:vAlign w:val="center"/>
-            <w:tcMar>
-              <w:top w:w="90" w:type="dxa"/>
-              <w:start w:w="90" w:type="dxa"/>
-              <w:bottom w:w="90" w:type="dxa"/>
-              <w:end w:w="90" w:type="dxa"/>
-            </w:tcMar>
+            <w:tcW w:w="4320" w:type="dxa"/>
             <w:tcBorders>
               <w:top w:val="single" w:sz="6" w:space="0" w:color="D9E2DD"/>
               <w:left w:val="single" w:sz="6" w:space="0" w:color="D9E2DD"/>
               <w:bottom w:val="single" w:sz="6" w:space="0" w:color="D9E2DD"/>
               <w:right w:val="single" w:sz="6" w:space="0" w:color="D9E2DD"/>
-              <w:insideH w:val="single" w:sz="6" w:space="0" w:color="D9E2DD"/>
-              <w:insideV w:val="single" w:sz="6" w:space="0" w:color="D9E2DD"/>
-            </w:tcBorders>
-            <w:shd w:fill="1A5C38"/>
+            </w:tcBorders>
+            <w:shd w:val="clear" w:color="auto" w:fill="1A5C38"/>
+            <w:tcMar>
+              <w:top w:w="90" w:type="dxa"/>
+              <w:left w:w="90" w:type="dxa"/>
+              <w:bottom w:w="90" w:type="dxa"/>
+              <w:right w:w="90" w:type="dxa"/>
+            </w:tcMar>
+            <w:vAlign w:val="center"/>
           </w:tcPr>
           <w:p>
             <w:pPr>
-              <w:spacing w:after="0" w:line="259" w:lineRule="auto"/>
+              <w:spacing w:line="259" w:lineRule="auto"/>
               <w:jc w:val="center"/>
             </w:pPr>
             <w:r>
@@ -20577,27 +20475,25 @@
         </w:tc>
         <w:tc>
           <w:tcPr>
-            <w:tcW w:type="dxa" w:w="5040"/>
-            <w:vAlign w:val="center"/>
-            <w:tcMar>
-              <w:top w:w="90" w:type="dxa"/>
-              <w:start w:w="90" w:type="dxa"/>
-              <w:bottom w:w="90" w:type="dxa"/>
-              <w:end w:w="90" w:type="dxa"/>
-            </w:tcMar>
+            <w:tcW w:w="5040" w:type="dxa"/>
             <w:tcBorders>
               <w:top w:val="single" w:sz="6" w:space="0" w:color="D9E2DD"/>
               <w:left w:val="single" w:sz="6" w:space="0" w:color="D9E2DD"/>
               <w:bottom w:val="single" w:sz="6" w:space="0" w:color="D9E2DD"/>
               <w:right w:val="single" w:sz="6" w:space="0" w:color="D9E2DD"/>
-              <w:insideH w:val="single" w:sz="6" w:space="0" w:color="D9E2DD"/>
-              <w:insideV w:val="single" w:sz="6" w:space="0" w:color="D9E2DD"/>
-            </w:tcBorders>
-            <w:shd w:fill="1A5C38"/>
+            </w:tcBorders>
+            <w:shd w:val="clear" w:color="auto" w:fill="1A5C38"/>
+            <w:tcMar>
+              <w:top w:w="90" w:type="dxa"/>
+              <w:left w:w="90" w:type="dxa"/>
+              <w:bottom w:w="90" w:type="dxa"/>
+              <w:right w:w="90" w:type="dxa"/>
+            </w:tcMar>
+            <w:vAlign w:val="center"/>
           </w:tcPr>
           <w:p>
             <w:pPr>
-              <w:spacing w:after="0" w:line="259" w:lineRule="auto"/>
+              <w:spacing w:line="259" w:lineRule="auto"/>
               <w:jc w:val="center"/>
             </w:pPr>
             <w:r>
@@ -20614,26 +20510,24 @@
       <w:tr>
         <w:tc>
           <w:tcPr>
-            <w:tcW w:type="dxa" w:w="2880"/>
-            <w:vAlign w:val="center"/>
-            <w:tcMar>
-              <w:top w:w="90" w:type="dxa"/>
-              <w:start w:w="90" w:type="dxa"/>
-              <w:bottom w:w="90" w:type="dxa"/>
-              <w:end w:w="90" w:type="dxa"/>
-            </w:tcMar>
+            <w:tcW w:w="2880" w:type="dxa"/>
             <w:tcBorders>
               <w:top w:val="single" w:sz="6" w:space="0" w:color="D9E2DD"/>
               <w:left w:val="single" w:sz="6" w:space="0" w:color="D9E2DD"/>
               <w:bottom w:val="single" w:sz="6" w:space="0" w:color="D9E2DD"/>
               <w:right w:val="single" w:sz="6" w:space="0" w:color="D9E2DD"/>
-              <w:insideH w:val="single" w:sz="6" w:space="0" w:color="D9E2DD"/>
-              <w:insideV w:val="single" w:sz="6" w:space="0" w:color="D9E2DD"/>
-            </w:tcBorders>
+            </w:tcBorders>
+            <w:tcMar>
+              <w:top w:w="90" w:type="dxa"/>
+              <w:left w:w="90" w:type="dxa"/>
+              <w:bottom w:w="90" w:type="dxa"/>
+              <w:right w:w="90" w:type="dxa"/>
+            </w:tcMar>
+            <w:vAlign w:val="center"/>
           </w:tcPr>
           <w:p>
             <w:pPr>
-              <w:spacing w:after="0" w:line="259" w:lineRule="auto"/>
+              <w:spacing w:line="259" w:lineRule="auto"/>
             </w:pPr>
             <w:r>
               <w:rPr>
@@ -20645,26 +20539,24 @@
         </w:tc>
         <w:tc>
           <w:tcPr>
-            <w:tcW w:type="dxa" w:w="4320"/>
-            <w:vAlign w:val="center"/>
-            <w:tcMar>
-              <w:top w:w="90" w:type="dxa"/>
-              <w:start w:w="90" w:type="dxa"/>
-              <w:bottom w:w="90" w:type="dxa"/>
-              <w:end w:w="90" w:type="dxa"/>
-            </w:tcMar>
+            <w:tcW w:w="4320" w:type="dxa"/>
             <w:tcBorders>
               <w:top w:val="single" w:sz="6" w:space="0" w:color="D9E2DD"/>
               <w:left w:val="single" w:sz="6" w:space="0" w:color="D9E2DD"/>
               <w:bottom w:val="single" w:sz="6" w:space="0" w:color="D9E2DD"/>
               <w:right w:val="single" w:sz="6" w:space="0" w:color="D9E2DD"/>
-              <w:insideH w:val="single" w:sz="6" w:space="0" w:color="D9E2DD"/>
-              <w:insideV w:val="single" w:sz="6" w:space="0" w:color="D9E2DD"/>
-            </w:tcBorders>
+            </w:tcBorders>
+            <w:tcMar>
+              <w:top w:w="90" w:type="dxa"/>
+              <w:left w:w="90" w:type="dxa"/>
+              <w:bottom w:w="90" w:type="dxa"/>
+              <w:right w:w="90" w:type="dxa"/>
+            </w:tcMar>
+            <w:vAlign w:val="center"/>
           </w:tcPr>
           <w:p>
             <w:pPr>
-              <w:spacing w:after="0" w:line="259" w:lineRule="auto"/>
+              <w:spacing w:line="259" w:lineRule="auto"/>
             </w:pPr>
             <w:r>
               <w:rPr>
@@ -20676,26 +20568,24 @@
         </w:tc>
         <w:tc>
           <w:tcPr>
-            <w:tcW w:type="dxa" w:w="5040"/>
-            <w:vAlign w:val="center"/>
-            <w:tcMar>
-              <w:top w:w="90" w:type="dxa"/>
-              <w:start w:w="90" w:type="dxa"/>
-              <w:bottom w:w="90" w:type="dxa"/>
-              <w:end w:w="90" w:type="dxa"/>
-            </w:tcMar>
+            <w:tcW w:w="5040" w:type="dxa"/>
             <w:tcBorders>
               <w:top w:val="single" w:sz="6" w:space="0" w:color="D9E2DD"/>
               <w:left w:val="single" w:sz="6" w:space="0" w:color="D9E2DD"/>
               <w:bottom w:val="single" w:sz="6" w:space="0" w:color="D9E2DD"/>
               <w:right w:val="single" w:sz="6" w:space="0" w:color="D9E2DD"/>
-              <w:insideH w:val="single" w:sz="6" w:space="0" w:color="D9E2DD"/>
-              <w:insideV w:val="single" w:sz="6" w:space="0" w:color="D9E2DD"/>
-            </w:tcBorders>
+            </w:tcBorders>
+            <w:tcMar>
+              <w:top w:w="90" w:type="dxa"/>
+              <w:left w:w="90" w:type="dxa"/>
+              <w:bottom w:w="90" w:type="dxa"/>
+              <w:right w:w="90" w:type="dxa"/>
+            </w:tcMar>
+            <w:vAlign w:val="center"/>
           </w:tcPr>
           <w:p>
             <w:pPr>
-              <w:spacing w:after="0" w:line="259" w:lineRule="auto"/>
+              <w:spacing w:line="259" w:lineRule="auto"/>
             </w:pPr>
             <w:r>
               <w:rPr>
@@ -20709,26 +20599,24 @@
       <w:tr>
         <w:tc>
           <w:tcPr>
-            <w:tcW w:type="dxa" w:w="2880"/>
-            <w:vAlign w:val="center"/>
-            <w:tcMar>
-              <w:top w:w="90" w:type="dxa"/>
-              <w:start w:w="90" w:type="dxa"/>
-              <w:bottom w:w="90" w:type="dxa"/>
-              <w:end w:w="90" w:type="dxa"/>
-            </w:tcMar>
+            <w:tcW w:w="2880" w:type="dxa"/>
             <w:tcBorders>
               <w:top w:val="single" w:sz="6" w:space="0" w:color="D9E2DD"/>
               <w:left w:val="single" w:sz="6" w:space="0" w:color="D9E2DD"/>
               <w:bottom w:val="single" w:sz="6" w:space="0" w:color="D9E2DD"/>
               <w:right w:val="single" w:sz="6" w:space="0" w:color="D9E2DD"/>
-              <w:insideH w:val="single" w:sz="6" w:space="0" w:color="D9E2DD"/>
-              <w:insideV w:val="single" w:sz="6" w:space="0" w:color="D9E2DD"/>
-            </w:tcBorders>
+            </w:tcBorders>
+            <w:tcMar>
+              <w:top w:w="90" w:type="dxa"/>
+              <w:left w:w="90" w:type="dxa"/>
+              <w:bottom w:w="90" w:type="dxa"/>
+              <w:right w:w="90" w:type="dxa"/>
+            </w:tcMar>
+            <w:vAlign w:val="center"/>
           </w:tcPr>
           <w:p>
             <w:pPr>
-              <w:spacing w:after="0" w:line="259" w:lineRule="auto"/>
+              <w:spacing w:line="259" w:lineRule="auto"/>
             </w:pPr>
             <w:r>
               <w:rPr>
@@ -20740,26 +20628,24 @@
         </w:tc>
         <w:tc>
           <w:tcPr>
-            <w:tcW w:type="dxa" w:w="4320"/>
-            <w:vAlign w:val="center"/>
-            <w:tcMar>
-              <w:top w:w="90" w:type="dxa"/>
-              <w:start w:w="90" w:type="dxa"/>
-              <w:bottom w:w="90" w:type="dxa"/>
-              <w:end w:w="90" w:type="dxa"/>
-            </w:tcMar>
+            <w:tcW w:w="4320" w:type="dxa"/>
             <w:tcBorders>
               <w:top w:val="single" w:sz="6" w:space="0" w:color="D9E2DD"/>
               <w:left w:val="single" w:sz="6" w:space="0" w:color="D9E2DD"/>
               <w:bottom w:val="single" w:sz="6" w:space="0" w:color="D9E2DD"/>
               <w:right w:val="single" w:sz="6" w:space="0" w:color="D9E2DD"/>
-              <w:insideH w:val="single" w:sz="6" w:space="0" w:color="D9E2DD"/>
-              <w:insideV w:val="single" w:sz="6" w:space="0" w:color="D9E2DD"/>
-            </w:tcBorders>
+            </w:tcBorders>
+            <w:tcMar>
+              <w:top w:w="90" w:type="dxa"/>
+              <w:left w:w="90" w:type="dxa"/>
+              <w:bottom w:w="90" w:type="dxa"/>
+              <w:right w:w="90" w:type="dxa"/>
+            </w:tcMar>
+            <w:vAlign w:val="center"/>
           </w:tcPr>
           <w:p>
             <w:pPr>
-              <w:spacing w:after="0" w:line="259" w:lineRule="auto"/>
+              <w:spacing w:line="259" w:lineRule="auto"/>
             </w:pPr>
             <w:r>
               <w:rPr>
@@ -20771,26 +20657,24 @@
         </w:tc>
         <w:tc>
           <w:tcPr>
-            <w:tcW w:type="dxa" w:w="5040"/>
-            <w:vAlign w:val="center"/>
-            <w:tcMar>
-              <w:top w:w="90" w:type="dxa"/>
-              <w:start w:w="90" w:type="dxa"/>
-              <w:bottom w:w="90" w:type="dxa"/>
-              <w:end w:w="90" w:type="dxa"/>
-            </w:tcMar>
+            <w:tcW w:w="5040" w:type="dxa"/>
             <w:tcBorders>
               <w:top w:val="single" w:sz="6" w:space="0" w:color="D9E2DD"/>
               <w:left w:val="single" w:sz="6" w:space="0" w:color="D9E2DD"/>
               <w:bottom w:val="single" w:sz="6" w:space="0" w:color="D9E2DD"/>
               <w:right w:val="single" w:sz="6" w:space="0" w:color="D9E2DD"/>
-              <w:insideH w:val="single" w:sz="6" w:space="0" w:color="D9E2DD"/>
-              <w:insideV w:val="single" w:sz="6" w:space="0" w:color="D9E2DD"/>
-            </w:tcBorders>
+            </w:tcBorders>
+            <w:tcMar>
+              <w:top w:w="90" w:type="dxa"/>
+              <w:left w:w="90" w:type="dxa"/>
+              <w:bottom w:w="90" w:type="dxa"/>
+              <w:right w:w="90" w:type="dxa"/>
+            </w:tcMar>
+            <w:vAlign w:val="center"/>
           </w:tcPr>
           <w:p>
             <w:pPr>
-              <w:spacing w:after="0" w:line="259" w:lineRule="auto"/>
+              <w:spacing w:line="259" w:lineRule="auto"/>
             </w:pPr>
             <w:r>
               <w:rPr>
@@ -20804,26 +20688,24 @@
       <w:tr>
         <w:tc>
           <w:tcPr>
-            <w:tcW w:type="dxa" w:w="2880"/>
-            <w:vAlign w:val="center"/>
-            <w:tcMar>
-              <w:top w:w="90" w:type="dxa"/>
-              <w:start w:w="90" w:type="dxa"/>
-              <w:bottom w:w="90" w:type="dxa"/>
-              <w:end w:w="90" w:type="dxa"/>
-            </w:tcMar>
+            <w:tcW w:w="2880" w:type="dxa"/>
             <w:tcBorders>
               <w:top w:val="single" w:sz="6" w:space="0" w:color="D9E2DD"/>
               <w:left w:val="single" w:sz="6" w:space="0" w:color="D9E2DD"/>
               <w:bottom w:val="single" w:sz="6" w:space="0" w:color="D9E2DD"/>
               <w:right w:val="single" w:sz="6" w:space="0" w:color="D9E2DD"/>
-              <w:insideH w:val="single" w:sz="6" w:space="0" w:color="D9E2DD"/>
-              <w:insideV w:val="single" w:sz="6" w:space="0" w:color="D9E2DD"/>
-            </w:tcBorders>
+            </w:tcBorders>
+            <w:tcMar>
+              <w:top w:w="90" w:type="dxa"/>
+              <w:left w:w="90" w:type="dxa"/>
+              <w:bottom w:w="90" w:type="dxa"/>
+              <w:right w:w="90" w:type="dxa"/>
+            </w:tcMar>
+            <w:vAlign w:val="center"/>
           </w:tcPr>
           <w:p>
             <w:pPr>
-              <w:spacing w:after="0" w:line="259" w:lineRule="auto"/>
+              <w:spacing w:line="259" w:lineRule="auto"/>
             </w:pPr>
             <w:r>
               <w:rPr>
@@ -20835,26 +20717,24 @@
         </w:tc>
         <w:tc>
           <w:tcPr>
-            <w:tcW w:type="dxa" w:w="4320"/>
-            <w:vAlign w:val="center"/>
-            <w:tcMar>
-              <w:top w:w="90" w:type="dxa"/>
-              <w:start w:w="90" w:type="dxa"/>
-              <w:bottom w:w="90" w:type="dxa"/>
-              <w:end w:w="90" w:type="dxa"/>
-            </w:tcMar>
+            <w:tcW w:w="4320" w:type="dxa"/>
             <w:tcBorders>
               <w:top w:val="single" w:sz="6" w:space="0" w:color="D9E2DD"/>
               <w:left w:val="single" w:sz="6" w:space="0" w:color="D9E2DD"/>
               <w:bottom w:val="single" w:sz="6" w:space="0" w:color="D9E2DD"/>
               <w:right w:val="single" w:sz="6" w:space="0" w:color="D9E2DD"/>
-              <w:insideH w:val="single" w:sz="6" w:space="0" w:color="D9E2DD"/>
-              <w:insideV w:val="single" w:sz="6" w:space="0" w:color="D9E2DD"/>
-            </w:tcBorders>
+            </w:tcBorders>
+            <w:tcMar>
+              <w:top w:w="90" w:type="dxa"/>
+              <w:left w:w="90" w:type="dxa"/>
+              <w:bottom w:w="90" w:type="dxa"/>
+              <w:right w:w="90" w:type="dxa"/>
+            </w:tcMar>
+            <w:vAlign w:val="center"/>
           </w:tcPr>
           <w:p>
             <w:pPr>
-              <w:spacing w:after="0" w:line="259" w:lineRule="auto"/>
+              <w:spacing w:line="259" w:lineRule="auto"/>
             </w:pPr>
             <w:r>
               <w:rPr>
@@ -20866,26 +20746,24 @@
         </w:tc>
         <w:tc>
           <w:tcPr>
-            <w:tcW w:type="dxa" w:w="5040"/>
-            <w:vAlign w:val="center"/>
-            <w:tcMar>
-              <w:top w:w="90" w:type="dxa"/>
-              <w:start w:w="90" w:type="dxa"/>
-              <w:bottom w:w="90" w:type="dxa"/>
-              <w:end w:w="90" w:type="dxa"/>
-            </w:tcMar>
+            <w:tcW w:w="5040" w:type="dxa"/>
             <w:tcBorders>
               <w:top w:val="single" w:sz="6" w:space="0" w:color="D9E2DD"/>
               <w:left w:val="single" w:sz="6" w:space="0" w:color="D9E2DD"/>
               <w:bottom w:val="single" w:sz="6" w:space="0" w:color="D9E2DD"/>
               <w:right w:val="single" w:sz="6" w:space="0" w:color="D9E2DD"/>
-              <w:insideH w:val="single" w:sz="6" w:space="0" w:color="D9E2DD"/>
-              <w:insideV w:val="single" w:sz="6" w:space="0" w:color="D9E2DD"/>
-            </w:tcBorders>
+            </w:tcBorders>
+            <w:tcMar>
+              <w:top w:w="90" w:type="dxa"/>
+              <w:left w:w="90" w:type="dxa"/>
+              <w:bottom w:w="90" w:type="dxa"/>
+              <w:right w:w="90" w:type="dxa"/>
+            </w:tcMar>
+            <w:vAlign w:val="center"/>
           </w:tcPr>
           <w:p>
             <w:pPr>
-              <w:spacing w:after="0" w:line="259" w:lineRule="auto"/>
+              <w:spacing w:line="259" w:lineRule="auto"/>
             </w:pPr>
             <w:r>
               <w:rPr>
@@ -20899,57 +20777,59 @@
       <w:tr>
         <w:tc>
           <w:tcPr>
-            <w:tcW w:type="dxa" w:w="2880"/>
-            <w:vAlign w:val="center"/>
-            <w:tcMar>
-              <w:top w:w="90" w:type="dxa"/>
-              <w:start w:w="90" w:type="dxa"/>
-              <w:bottom w:w="90" w:type="dxa"/>
-              <w:end w:w="90" w:type="dxa"/>
-            </w:tcMar>
+            <w:tcW w:w="2880" w:type="dxa"/>
             <w:tcBorders>
               <w:top w:val="single" w:sz="6" w:space="0" w:color="D9E2DD"/>
               <w:left w:val="single" w:sz="6" w:space="0" w:color="D9E2DD"/>
               <w:bottom w:val="single" w:sz="6" w:space="0" w:color="D9E2DD"/>
               <w:right w:val="single" w:sz="6" w:space="0" w:color="D9E2DD"/>
-              <w:insideH w:val="single" w:sz="6" w:space="0" w:color="D9E2DD"/>
-              <w:insideV w:val="single" w:sz="6" w:space="0" w:color="D9E2DD"/>
-            </w:tcBorders>
+            </w:tcBorders>
+            <w:tcMar>
+              <w:top w:w="90" w:type="dxa"/>
+              <w:left w:w="90" w:type="dxa"/>
+              <w:bottom w:w="90" w:type="dxa"/>
+              <w:right w:w="90" w:type="dxa"/>
+            </w:tcMar>
+            <w:vAlign w:val="center"/>
           </w:tcPr>
           <w:p>
             <w:pPr>
-              <w:spacing w:after="0" w:line="259" w:lineRule="auto"/>
+              <w:spacing w:line="259" w:lineRule="auto"/>
             </w:pPr>
             <w:r>
               <w:rPr>
                 <w:sz w:val="17"/>
               </w:rPr>
-              <w:t>Zayka Pro Advanced Analytics</w:t>
-            </w:r>
-          </w:p>
-        </w:tc>
-        <w:tc>
-          <w:tcPr>
-            <w:tcW w:type="dxa" w:w="4320"/>
-            <w:vAlign w:val="center"/>
-            <w:tcMar>
-              <w:top w:w="90" w:type="dxa"/>
-              <w:start w:w="90" w:type="dxa"/>
-              <w:bottom w:w="90" w:type="dxa"/>
-              <w:end w:w="90" w:type="dxa"/>
-            </w:tcMar>
+              <w:t>Zaika</w:t>
+            </w:r>
+            <w:r>
+              <w:rPr>
+                <w:sz w:val="17"/>
+              </w:rPr>
+              <w:t xml:space="preserve"> Pro Advanced Analytics</w:t>
+            </w:r>
+          </w:p>
+        </w:tc>
+        <w:tc>
+          <w:tcPr>
+            <w:tcW w:w="4320" w:type="dxa"/>
             <w:tcBorders>
               <w:top w:val="single" w:sz="6" w:space="0" w:color="D9E2DD"/>
               <w:left w:val="single" w:sz="6" w:space="0" w:color="D9E2DD"/>
               <w:bottom w:val="single" w:sz="6" w:space="0" w:color="D9E2DD"/>
               <w:right w:val="single" w:sz="6" w:space="0" w:color="D9E2DD"/>
-              <w:insideH w:val="single" w:sz="6" w:space="0" w:color="D9E2DD"/>
-              <w:insideV w:val="single" w:sz="6" w:space="0" w:color="D9E2DD"/>
-            </w:tcBorders>
+            </w:tcBorders>
+            <w:tcMar>
+              <w:top w:w="90" w:type="dxa"/>
+              <w:left w:w="90" w:type="dxa"/>
+              <w:bottom w:w="90" w:type="dxa"/>
+              <w:right w:w="90" w:type="dxa"/>
+            </w:tcMar>
+            <w:vAlign w:val="center"/>
           </w:tcPr>
           <w:p>
             <w:pPr>
-              <w:spacing w:after="0" w:line="259" w:lineRule="auto"/>
+              <w:spacing w:line="259" w:lineRule="auto"/>
             </w:pPr>
             <w:r>
               <w:rPr>
@@ -20961,26 +20841,24 @@
         </w:tc>
         <w:tc>
           <w:tcPr>
-            <w:tcW w:type="dxa" w:w="5040"/>
-            <w:vAlign w:val="center"/>
-            <w:tcMar>
-              <w:top w:w="90" w:type="dxa"/>
-              <w:start w:w="90" w:type="dxa"/>
-              <w:bottom w:w="90" w:type="dxa"/>
-              <w:end w:w="90" w:type="dxa"/>
-            </w:tcMar>
+            <w:tcW w:w="5040" w:type="dxa"/>
             <w:tcBorders>
               <w:top w:val="single" w:sz="6" w:space="0" w:color="D9E2DD"/>
               <w:left w:val="single" w:sz="6" w:space="0" w:color="D9E2DD"/>
               <w:bottom w:val="single" w:sz="6" w:space="0" w:color="D9E2DD"/>
               <w:right w:val="single" w:sz="6" w:space="0" w:color="D9E2DD"/>
-              <w:insideH w:val="single" w:sz="6" w:space="0" w:color="D9E2DD"/>
-              <w:insideV w:val="single" w:sz="6" w:space="0" w:color="D9E2DD"/>
-            </w:tcBorders>
+            </w:tcBorders>
+            <w:tcMar>
+              <w:top w:w="90" w:type="dxa"/>
+              <w:left w:w="90" w:type="dxa"/>
+              <w:bottom w:w="90" w:type="dxa"/>
+              <w:right w:w="90" w:type="dxa"/>
+            </w:tcMar>
+            <w:vAlign w:val="center"/>
           </w:tcPr>
           <w:p>
             <w:pPr>
-              <w:spacing w:after="0" w:line="259" w:lineRule="auto"/>
+              <w:spacing w:line="259" w:lineRule="auto"/>
             </w:pPr>
             <w:r>
               <w:rPr>
@@ -20994,26 +20872,24 @@
       <w:tr>
         <w:tc>
           <w:tcPr>
-            <w:tcW w:type="dxa" w:w="2880"/>
-            <w:vAlign w:val="center"/>
-            <w:tcMar>
-              <w:top w:w="90" w:type="dxa"/>
-              <w:start w:w="90" w:type="dxa"/>
-              <w:bottom w:w="90" w:type="dxa"/>
-              <w:end w:w="90" w:type="dxa"/>
-            </w:tcMar>
+            <w:tcW w:w="2880" w:type="dxa"/>
             <w:tcBorders>
               <w:top w:val="single" w:sz="6" w:space="0" w:color="D9E2DD"/>
               <w:left w:val="single" w:sz="6" w:space="0" w:color="D9E2DD"/>
               <w:bottom w:val="single" w:sz="6" w:space="0" w:color="D9E2DD"/>
               <w:right w:val="single" w:sz="6" w:space="0" w:color="D9E2DD"/>
-              <w:insideH w:val="single" w:sz="6" w:space="0" w:color="D9E2DD"/>
-              <w:insideV w:val="single" w:sz="6" w:space="0" w:color="D9E2DD"/>
-            </w:tcBorders>
+            </w:tcBorders>
+            <w:tcMar>
+              <w:top w:w="90" w:type="dxa"/>
+              <w:left w:w="90" w:type="dxa"/>
+              <w:bottom w:w="90" w:type="dxa"/>
+              <w:right w:w="90" w:type="dxa"/>
+            </w:tcMar>
+            <w:vAlign w:val="center"/>
           </w:tcPr>
           <w:p>
             <w:pPr>
-              <w:spacing w:after="0" w:line="259" w:lineRule="auto"/>
+              <w:spacing w:line="259" w:lineRule="auto"/>
             </w:pPr>
             <w:r>
               <w:rPr>
@@ -21025,26 +20901,24 @@
         </w:tc>
         <w:tc>
           <w:tcPr>
-            <w:tcW w:type="dxa" w:w="4320"/>
-            <w:vAlign w:val="center"/>
-            <w:tcMar>
-              <w:top w:w="90" w:type="dxa"/>
-              <w:start w:w="90" w:type="dxa"/>
-              <w:bottom w:w="90" w:type="dxa"/>
-              <w:end w:w="90" w:type="dxa"/>
-            </w:tcMar>
+            <w:tcW w:w="4320" w:type="dxa"/>
             <w:tcBorders>
               <w:top w:val="single" w:sz="6" w:space="0" w:color="D9E2DD"/>
               <w:left w:val="single" w:sz="6" w:space="0" w:color="D9E2DD"/>
               <w:bottom w:val="single" w:sz="6" w:space="0" w:color="D9E2DD"/>
               <w:right w:val="single" w:sz="6" w:space="0" w:color="D9E2DD"/>
-              <w:insideH w:val="single" w:sz="6" w:space="0" w:color="D9E2DD"/>
-              <w:insideV w:val="single" w:sz="6" w:space="0" w:color="D9E2DD"/>
-            </w:tcBorders>
+            </w:tcBorders>
+            <w:tcMar>
+              <w:top w:w="90" w:type="dxa"/>
+              <w:left w:w="90" w:type="dxa"/>
+              <w:bottom w:w="90" w:type="dxa"/>
+              <w:right w:w="90" w:type="dxa"/>
+            </w:tcMar>
+            <w:vAlign w:val="center"/>
           </w:tcPr>
           <w:p>
             <w:pPr>
-              <w:spacing w:after="0" w:line="259" w:lineRule="auto"/>
+              <w:spacing w:line="259" w:lineRule="auto"/>
             </w:pPr>
             <w:r>
               <w:rPr>
@@ -21056,26 +20930,24 @@
         </w:tc>
         <w:tc>
           <w:tcPr>
-            <w:tcW w:type="dxa" w:w="5040"/>
-            <w:vAlign w:val="center"/>
-            <w:tcMar>
-              <w:top w:w="90" w:type="dxa"/>
-              <w:start w:w="90" w:type="dxa"/>
-              <w:bottom w:w="90" w:type="dxa"/>
-              <w:end w:w="90" w:type="dxa"/>
-            </w:tcMar>
+            <w:tcW w:w="5040" w:type="dxa"/>
             <w:tcBorders>
               <w:top w:val="single" w:sz="6" w:space="0" w:color="D9E2DD"/>
               <w:left w:val="single" w:sz="6" w:space="0" w:color="D9E2DD"/>
               <w:bottom w:val="single" w:sz="6" w:space="0" w:color="D9E2DD"/>
               <w:right w:val="single" w:sz="6" w:space="0" w:color="D9E2DD"/>
-              <w:insideH w:val="single" w:sz="6" w:space="0" w:color="D9E2DD"/>
-              <w:insideV w:val="single" w:sz="6" w:space="0" w:color="D9E2DD"/>
-            </w:tcBorders>
+            </w:tcBorders>
+            <w:tcMar>
+              <w:top w:w="90" w:type="dxa"/>
+              <w:left w:w="90" w:type="dxa"/>
+              <w:bottom w:w="90" w:type="dxa"/>
+              <w:right w:w="90" w:type="dxa"/>
+            </w:tcMar>
+            <w:vAlign w:val="center"/>
           </w:tcPr>
           <w:p>
             <w:pPr>
-              <w:spacing w:after="0" w:line="259" w:lineRule="auto"/>
+              <w:spacing w:line="259" w:lineRule="auto"/>
             </w:pPr>
             <w:r>
               <w:rPr>
@@ -21099,38 +20971,36 @@
     </w:p>
     <w:tbl>
       <w:tblPr>
-        <w:tblW w:type="auto" w:w="0"/>
+        <w:tblW w:w="0" w:type="auto"/>
         <w:tblLayout w:type="fixed"/>
-        <w:tblLook w:firstColumn="1" w:firstRow="1" w:lastColumn="0" w:lastRow="0" w:noHBand="0" w:noVBand="1" w:val="04A0"/>
+        <w:tblLook w:val="04A0" w:firstRow="1" w:lastRow="0" w:firstColumn="1" w:lastColumn="0" w:noHBand="0" w:noVBand="1"/>
       </w:tblPr>
       <w:tblGrid>
-        <w:gridCol w:w="4680"/>
-        <w:gridCol w:w="4680"/>
+        <w:gridCol w:w="6120"/>
+        <w:gridCol w:w="6120"/>
       </w:tblGrid>
       <w:tr>
         <w:tc>
           <w:tcPr>
-            <w:tcW w:type="dxa" w:w="6120"/>
-            <w:vAlign w:val="center"/>
-            <w:tcMar>
-              <w:top w:w="90" w:type="dxa"/>
-              <w:start w:w="90" w:type="dxa"/>
-              <w:bottom w:w="90" w:type="dxa"/>
-              <w:end w:w="90" w:type="dxa"/>
-            </w:tcMar>
+            <w:tcW w:w="6120" w:type="dxa"/>
             <w:tcBorders>
               <w:top w:val="single" w:sz="6" w:space="0" w:color="D9E2DD"/>
               <w:left w:val="single" w:sz="6" w:space="0" w:color="D9E2DD"/>
               <w:bottom w:val="single" w:sz="6" w:space="0" w:color="D9E2DD"/>
               <w:right w:val="single" w:sz="6" w:space="0" w:color="D9E2DD"/>
-              <w:insideH w:val="single" w:sz="6" w:space="0" w:color="D9E2DD"/>
-              <w:insideV w:val="single" w:sz="6" w:space="0" w:color="D9E2DD"/>
-            </w:tcBorders>
-            <w:shd w:fill="1A5C38"/>
+            </w:tcBorders>
+            <w:shd w:val="clear" w:color="auto" w:fill="1A5C38"/>
+            <w:tcMar>
+              <w:top w:w="90" w:type="dxa"/>
+              <w:left w:w="90" w:type="dxa"/>
+              <w:bottom w:w="90" w:type="dxa"/>
+              <w:right w:w="90" w:type="dxa"/>
+            </w:tcMar>
+            <w:vAlign w:val="center"/>
           </w:tcPr>
           <w:p>
             <w:pPr>
-              <w:spacing w:after="0" w:line="259" w:lineRule="auto"/>
+              <w:spacing w:line="259" w:lineRule="auto"/>
               <w:jc w:val="center"/>
             </w:pPr>
             <w:r>
@@ -21145,27 +21015,25 @@
         </w:tc>
         <w:tc>
           <w:tcPr>
-            <w:tcW w:type="dxa" w:w="6120"/>
-            <w:vAlign w:val="center"/>
-            <w:tcMar>
-              <w:top w:w="90" w:type="dxa"/>
-              <w:start w:w="90" w:type="dxa"/>
-              <w:bottom w:w="90" w:type="dxa"/>
-              <w:end w:w="90" w:type="dxa"/>
-            </w:tcMar>
+            <w:tcW w:w="6120" w:type="dxa"/>
             <w:tcBorders>
               <w:top w:val="single" w:sz="6" w:space="0" w:color="D9E2DD"/>
               <w:left w:val="single" w:sz="6" w:space="0" w:color="D9E2DD"/>
               <w:bottom w:val="single" w:sz="6" w:space="0" w:color="D9E2DD"/>
               <w:right w:val="single" w:sz="6" w:space="0" w:color="D9E2DD"/>
-              <w:insideH w:val="single" w:sz="6" w:space="0" w:color="D9E2DD"/>
-              <w:insideV w:val="single" w:sz="6" w:space="0" w:color="D9E2DD"/>
-            </w:tcBorders>
-            <w:shd w:fill="1A5C38"/>
+            </w:tcBorders>
+            <w:shd w:val="clear" w:color="auto" w:fill="1A5C38"/>
+            <w:tcMar>
+              <w:top w:w="90" w:type="dxa"/>
+              <w:left w:w="90" w:type="dxa"/>
+              <w:bottom w:w="90" w:type="dxa"/>
+              <w:right w:w="90" w:type="dxa"/>
+            </w:tcMar>
+            <w:vAlign w:val="center"/>
           </w:tcPr>
           <w:p>
             <w:pPr>
-              <w:spacing w:after="0" w:line="259" w:lineRule="auto"/>
+              <w:spacing w:line="259" w:lineRule="auto"/>
               <w:jc w:val="center"/>
             </w:pPr>
             <w:r>
@@ -21182,27 +21050,25 @@
       <w:tr>
         <w:tc>
           <w:tcPr>
-            <w:tcW w:type="dxa" w:w="6120"/>
-            <w:vAlign w:val="center"/>
-            <w:tcMar>
-              <w:top w:w="90" w:type="dxa"/>
-              <w:start w:w="90" w:type="dxa"/>
-              <w:bottom w:w="90" w:type="dxa"/>
-              <w:end w:w="90" w:type="dxa"/>
-            </w:tcMar>
+            <w:tcW w:w="6120" w:type="dxa"/>
             <w:tcBorders>
               <w:top w:val="single" w:sz="6" w:space="0" w:color="D9E2DD"/>
               <w:left w:val="single" w:sz="6" w:space="0" w:color="D9E2DD"/>
               <w:bottom w:val="single" w:sz="6" w:space="0" w:color="D9E2DD"/>
               <w:right w:val="single" w:sz="6" w:space="0" w:color="D9E2DD"/>
-              <w:insideH w:val="single" w:sz="6" w:space="0" w:color="D9E2DD"/>
-              <w:insideV w:val="single" w:sz="6" w:space="0" w:color="D9E2DD"/>
-            </w:tcBorders>
-            <w:shd w:fill="FFF8F0"/>
+            </w:tcBorders>
+            <w:shd w:val="clear" w:color="auto" w:fill="FFF8F0"/>
+            <w:tcMar>
+              <w:top w:w="90" w:type="dxa"/>
+              <w:left w:w="90" w:type="dxa"/>
+              <w:bottom w:w="90" w:type="dxa"/>
+              <w:right w:w="90" w:type="dxa"/>
+            </w:tcMar>
+            <w:vAlign w:val="center"/>
           </w:tcPr>
           <w:p>
             <w:pPr>
-              <w:spacing w:after="0" w:line="259" w:lineRule="auto"/>
+              <w:spacing w:line="259" w:lineRule="auto"/>
             </w:pPr>
             <w:r>
               <w:rPr>
@@ -21214,27 +21080,25 @@
         </w:tc>
         <w:tc>
           <w:tcPr>
-            <w:tcW w:type="dxa" w:w="6120"/>
-            <w:vAlign w:val="center"/>
-            <w:tcMar>
-              <w:top w:w="90" w:type="dxa"/>
-              <w:start w:w="90" w:type="dxa"/>
-              <w:bottom w:w="90" w:type="dxa"/>
-              <w:end w:w="90" w:type="dxa"/>
-            </w:tcMar>
+            <w:tcW w:w="6120" w:type="dxa"/>
             <w:tcBorders>
               <w:top w:val="single" w:sz="6" w:space="0" w:color="D9E2DD"/>
               <w:left w:val="single" w:sz="6" w:space="0" w:color="D9E2DD"/>
               <w:bottom w:val="single" w:sz="6" w:space="0" w:color="D9E2DD"/>
               <w:right w:val="single" w:sz="6" w:space="0" w:color="D9E2DD"/>
-              <w:insideH w:val="single" w:sz="6" w:space="0" w:color="D9E2DD"/>
-              <w:insideV w:val="single" w:sz="6" w:space="0" w:color="D9E2DD"/>
-            </w:tcBorders>
-            <w:shd w:fill="FFF3CF"/>
+            </w:tcBorders>
+            <w:shd w:val="clear" w:color="auto" w:fill="FFF3CF"/>
+            <w:tcMar>
+              <w:top w:w="90" w:type="dxa"/>
+              <w:left w:w="90" w:type="dxa"/>
+              <w:bottom w:w="90" w:type="dxa"/>
+              <w:right w:w="90" w:type="dxa"/>
+            </w:tcMar>
+            <w:vAlign w:val="center"/>
           </w:tcPr>
           <w:p>
             <w:pPr>
-              <w:spacing w:after="0" w:line="259" w:lineRule="auto"/>
+              <w:spacing w:line="259" w:lineRule="auto"/>
             </w:pPr>
             <w:r>
               <w:rPr>
@@ -24775,6 +24639,7 @@
   <w:style w:type="character" w:default="1" w:styleId="DefaultParagraphFont">
     <w:name w:val="Default Paragraph Font"/>
     <w:uiPriority w:val="1"/>
+    <w:semiHidden/>
     <w:unhideWhenUsed/>
   </w:style>
   <w:style w:type="table" w:default="1" w:styleId="TableNormal">

</xml_diff>